<commit_message>
Fin chap 3 study guide
</commit_message>
<xml_diff>
--- a/Exam1/Ch3_Study_Guide.docx
+++ b/Exam1/Ch3_Study_Guide.docx
@@ -2,7 +2,2625 @@
 <file path=word/document.xml><?xml version="1.0" encoding="utf-8"?>
 <w:document xmlns:wpc="http://schemas.microsoft.com/office/word/2010/wordprocessingCanvas" xmlns:cx="http://schemas.microsoft.com/office/drawing/2014/chartex" xmlns:cx1="http://schemas.microsoft.com/office/drawing/2015/9/8/chartex" xmlns:cx2="http://schemas.microsoft.com/office/drawing/2015/10/21/chartex" xmlns:cx3="http://schemas.microsoft.com/office/drawing/2016/5/9/chartex" xmlns:cx4="http://schemas.microsoft.com/office/drawing/2016/5/10/chartex" xmlns:cx5="http://schemas.microsoft.com/office/drawing/2016/5/11/chartex" xmlns:cx6="http://schemas.microsoft.com/office/drawing/2016/5/12/chartex" xmlns:cx7="http://schemas.microsoft.com/office/drawing/2016/5/13/chartex" xmlns:cx8="http://schemas.microsoft.com/office/drawing/2016/5/14/chartex" xmlns:mc="http://schemas.openxmlformats.org/markup-compatibility/2006" xmlns:aink="http://schemas.microsoft.com/office/drawing/2016/ink" xmlns:am3d="http://schemas.microsoft.com/office/drawing/2017/model3d" xmlns:o="urn:schemas-microsoft-com:office:office" xmlns:oel="http://schemas.microsoft.com/office/2019/extlst" xmlns:r="http://schemas.openxmlformats.org/officeDocument/2006/relationships" xmlns:m="http://schemas.openxmlformats.org/officeDocument/2006/math" xmlns:v="urn:schemas-microsoft-com:vml" xmlns:wp14="http://schemas.microsoft.com/office/word/2010/wordprocessingDrawing" xmlns:wp="http://schemas.openxmlformats.org/drawingml/2006/wordprocessingDrawing" xmlns:w10="urn:schemas-microsoft-com:office:word" xmlns:w="http://schemas.openxmlformats.org/wordprocessingml/2006/main" xmlns:w14="http://schemas.microsoft.com/office/word/2010/wordml" xmlns:w15="http://schemas.microsoft.com/office/word/2012/wordml" xmlns:w16cex="http://schemas.microsoft.com/office/word/2018/wordml/cex" xmlns:w16cid="http://schemas.microsoft.com/office/word/2016/wordml/cid" xmlns:w16="http://schemas.microsoft.com/office/word/2018/wordml" xmlns:w16du="http://schemas.microsoft.com/office/word/2023/wordml/word16du" xmlns:w16sdtdh="http://schemas.microsoft.com/office/word/2020/wordml/sdtdatahash" xmlns:w16sdtfl="http://schemas.microsoft.com/office/word/2024/wordml/sdtformatlock" xmlns:w16se="http://schemas.microsoft.com/office/word/2015/wordml/symex" xmlns:wpg="http://schemas.microsoft.com/office/word/2010/wordprocessingGroup" xmlns:wpi="http://schemas.microsoft.com/office/word/2010/wordprocessingInk" xmlns:wne="http://schemas.microsoft.com/office/word/2006/wordml" xmlns:wps="http://schemas.microsoft.com/office/word/2010/wordprocessingShape" mc:Ignorable="w14 w15 w16se w16cid w16 w16cex w16sdtdh w16sdtfl w16du wp14">
   <w:body>
-    <w:p/>
+    <w:p>
+      <w:r>
+        <w:drawing>
+          <wp:anchor distT="0" distB="0" distL="114300" distR="114300" simplePos="0" relativeHeight="251732992" behindDoc="0" locked="0" layoutInCell="1" allowOverlap="1" wp14:anchorId="3328DCF7" wp14:editId="6AB4BE4B">
+            <wp:simplePos x="0" y="0"/>
+            <wp:positionH relativeFrom="margin">
+              <wp:posOffset>-255318</wp:posOffset>
+            </wp:positionH>
+            <wp:positionV relativeFrom="paragraph">
+              <wp:posOffset>-338447</wp:posOffset>
+            </wp:positionV>
+            <wp:extent cx="1808408" cy="514350"/>
+            <wp:effectExtent l="0" t="0" r="1905" b="0"/>
+            <wp:wrapNone/>
+            <wp:docPr id="1537734888" name="Picture 1"/>
+            <wp:cNvGraphicFramePr>
+              <a:graphicFrameLocks xmlns:a="http://schemas.openxmlformats.org/drawingml/2006/main" noChangeAspect="1"/>
+            </wp:cNvGraphicFramePr>
+            <a:graphic xmlns:a="http://schemas.openxmlformats.org/drawingml/2006/main">
+              <a:graphicData uri="http://schemas.openxmlformats.org/drawingml/2006/picture">
+                <pic:pic xmlns:pic="http://schemas.openxmlformats.org/drawingml/2006/picture">
+                  <pic:nvPicPr>
+                    <pic:cNvPr id="1537734888" name=""/>
+                    <pic:cNvPicPr/>
+                  </pic:nvPicPr>
+                  <pic:blipFill>
+                    <a:blip r:embed="rId4"/>
+                    <a:stretch>
+                      <a:fillRect/>
+                    </a:stretch>
+                  </pic:blipFill>
+                  <pic:spPr>
+                    <a:xfrm>
+                      <a:off x="0" y="0"/>
+                      <a:ext cx="1813747" cy="515868"/>
+                    </a:xfrm>
+                    <a:prstGeom prst="rect">
+                      <a:avLst/>
+                    </a:prstGeom>
+                  </pic:spPr>
+                </pic:pic>
+              </a:graphicData>
+            </a:graphic>
+            <wp14:sizeRelH relativeFrom="margin">
+              <wp14:pctWidth>0</wp14:pctWidth>
+            </wp14:sizeRelH>
+            <wp14:sizeRelV relativeFrom="margin">
+              <wp14:pctHeight>0</wp14:pctHeight>
+            </wp14:sizeRelV>
+          </wp:anchor>
+        </w:drawing>
+      </w:r>
+      <w:r>
+        <w:drawing>
+          <wp:anchor distT="0" distB="0" distL="114300" distR="114300" simplePos="0" relativeHeight="251656189" behindDoc="0" locked="0" layoutInCell="1" allowOverlap="1" wp14:anchorId="146C5252" wp14:editId="7280C4BD">
+            <wp:simplePos x="0" y="0"/>
+            <wp:positionH relativeFrom="margin">
+              <wp:posOffset>4993574</wp:posOffset>
+            </wp:positionH>
+            <wp:positionV relativeFrom="paragraph">
+              <wp:posOffset>8473044</wp:posOffset>
+            </wp:positionV>
+            <wp:extent cx="2179840" cy="1022985"/>
+            <wp:effectExtent l="0" t="0" r="0" b="5715"/>
+            <wp:wrapNone/>
+            <wp:docPr id="1915601503" name="Picture 1"/>
+            <wp:cNvGraphicFramePr>
+              <a:graphicFrameLocks xmlns:a="http://schemas.openxmlformats.org/drawingml/2006/main" noChangeAspect="1"/>
+            </wp:cNvGraphicFramePr>
+            <a:graphic xmlns:a="http://schemas.openxmlformats.org/drawingml/2006/main">
+              <a:graphicData uri="http://schemas.openxmlformats.org/drawingml/2006/picture">
+                <pic:pic xmlns:pic="http://schemas.openxmlformats.org/drawingml/2006/picture">
+                  <pic:nvPicPr>
+                    <pic:cNvPr id="1915601503" name=""/>
+                    <pic:cNvPicPr/>
+                  </pic:nvPicPr>
+                  <pic:blipFill>
+                    <a:blip r:embed="rId5"/>
+                    <a:stretch>
+                      <a:fillRect/>
+                    </a:stretch>
+                  </pic:blipFill>
+                  <pic:spPr>
+                    <a:xfrm>
+                      <a:off x="0" y="0"/>
+                      <a:ext cx="2182525" cy="1024245"/>
+                    </a:xfrm>
+                    <a:prstGeom prst="rect">
+                      <a:avLst/>
+                    </a:prstGeom>
+                  </pic:spPr>
+                </pic:pic>
+              </a:graphicData>
+            </a:graphic>
+            <wp14:sizeRelH relativeFrom="margin">
+              <wp14:pctWidth>0</wp14:pctWidth>
+            </wp14:sizeRelH>
+            <wp14:sizeRelV relativeFrom="margin">
+              <wp14:pctHeight>0</wp14:pctHeight>
+            </wp14:sizeRelV>
+          </wp:anchor>
+        </w:drawing>
+      </w:r>
+      <w:r>
+        <w:drawing>
+          <wp:anchor distT="0" distB="0" distL="114300" distR="114300" simplePos="0" relativeHeight="251766784" behindDoc="0" locked="0" layoutInCell="1" allowOverlap="1" wp14:anchorId="18648EE1" wp14:editId="4A2C6357">
+            <wp:simplePos x="0" y="0"/>
+            <wp:positionH relativeFrom="column">
+              <wp:posOffset>2131374</wp:posOffset>
+            </wp:positionH>
+            <wp:positionV relativeFrom="paragraph">
+              <wp:posOffset>8735645</wp:posOffset>
+            </wp:positionV>
+            <wp:extent cx="3046021" cy="589461"/>
+            <wp:effectExtent l="0" t="0" r="2540" b="1270"/>
+            <wp:wrapNone/>
+            <wp:docPr id="300276043" name="Picture 1"/>
+            <wp:cNvGraphicFramePr>
+              <a:graphicFrameLocks xmlns:a="http://schemas.openxmlformats.org/drawingml/2006/main" noChangeAspect="1"/>
+            </wp:cNvGraphicFramePr>
+            <a:graphic xmlns:a="http://schemas.openxmlformats.org/drawingml/2006/main">
+              <a:graphicData uri="http://schemas.openxmlformats.org/drawingml/2006/picture">
+                <pic:pic xmlns:pic="http://schemas.openxmlformats.org/drawingml/2006/picture">
+                  <pic:nvPicPr>
+                    <pic:cNvPr id="300276043" name=""/>
+                    <pic:cNvPicPr/>
+                  </pic:nvPicPr>
+                  <pic:blipFill>
+                    <a:blip r:embed="rId6"/>
+                    <a:stretch>
+                      <a:fillRect/>
+                    </a:stretch>
+                  </pic:blipFill>
+                  <pic:spPr>
+                    <a:xfrm>
+                      <a:off x="0" y="0"/>
+                      <a:ext cx="3046021" cy="589461"/>
+                    </a:xfrm>
+                    <a:prstGeom prst="rect">
+                      <a:avLst/>
+                    </a:prstGeom>
+                  </pic:spPr>
+                </pic:pic>
+              </a:graphicData>
+            </a:graphic>
+            <wp14:sizeRelH relativeFrom="margin">
+              <wp14:pctWidth>0</wp14:pctWidth>
+            </wp14:sizeRelH>
+            <wp14:sizeRelV relativeFrom="margin">
+              <wp14:pctHeight>0</wp14:pctHeight>
+            </wp14:sizeRelV>
+          </wp:anchor>
+        </w:drawing>
+      </w:r>
+      <w:r>
+        <w:drawing>
+          <wp:anchor distT="0" distB="0" distL="114300" distR="114300" simplePos="0" relativeHeight="251764736" behindDoc="0" locked="0" layoutInCell="1" allowOverlap="1" wp14:anchorId="3CFAFA5C" wp14:editId="4A6CEA62">
+            <wp:simplePos x="0" y="0"/>
+            <wp:positionH relativeFrom="column">
+              <wp:posOffset>2134862</wp:posOffset>
+            </wp:positionH>
+            <wp:positionV relativeFrom="paragraph">
+              <wp:posOffset>8416282</wp:posOffset>
+            </wp:positionV>
+            <wp:extent cx="2078182" cy="292632"/>
+            <wp:effectExtent l="0" t="0" r="0" b="0"/>
+            <wp:wrapNone/>
+            <wp:docPr id="380233374" name="Picture 1"/>
+            <wp:cNvGraphicFramePr>
+              <a:graphicFrameLocks xmlns:a="http://schemas.openxmlformats.org/drawingml/2006/main" noChangeAspect="1"/>
+            </wp:cNvGraphicFramePr>
+            <a:graphic xmlns:a="http://schemas.openxmlformats.org/drawingml/2006/main">
+              <a:graphicData uri="http://schemas.openxmlformats.org/drawingml/2006/picture">
+                <pic:pic xmlns:pic="http://schemas.openxmlformats.org/drawingml/2006/picture">
+                  <pic:nvPicPr>
+                    <pic:cNvPr id="380233374" name=""/>
+                    <pic:cNvPicPr/>
+                  </pic:nvPicPr>
+                  <pic:blipFill>
+                    <a:blip r:embed="rId7"/>
+                    <a:stretch>
+                      <a:fillRect/>
+                    </a:stretch>
+                  </pic:blipFill>
+                  <pic:spPr>
+                    <a:xfrm>
+                      <a:off x="0" y="0"/>
+                      <a:ext cx="2078182" cy="292632"/>
+                    </a:xfrm>
+                    <a:prstGeom prst="rect">
+                      <a:avLst/>
+                    </a:prstGeom>
+                  </pic:spPr>
+                </pic:pic>
+              </a:graphicData>
+            </a:graphic>
+            <wp14:sizeRelH relativeFrom="margin">
+              <wp14:pctWidth>0</wp14:pctWidth>
+            </wp14:sizeRelH>
+            <wp14:sizeRelV relativeFrom="margin">
+              <wp14:pctHeight>0</wp14:pctHeight>
+            </wp14:sizeRelV>
+          </wp:anchor>
+        </w:drawing>
+      </w:r>
+      <w:r>
+        <w:drawing>
+          <wp:anchor distT="0" distB="0" distL="114300" distR="114300" simplePos="0" relativeHeight="251761664" behindDoc="0" locked="0" layoutInCell="1" allowOverlap="1" wp14:anchorId="03DCCCEE" wp14:editId="73280B6B">
+            <wp:simplePos x="0" y="0"/>
+            <wp:positionH relativeFrom="margin">
+              <wp:posOffset>4411683</wp:posOffset>
+            </wp:positionH>
+            <wp:positionV relativeFrom="paragraph">
+              <wp:posOffset>6762997</wp:posOffset>
+            </wp:positionV>
+            <wp:extent cx="2768697" cy="1674421"/>
+            <wp:effectExtent l="0" t="0" r="0" b="2540"/>
+            <wp:wrapNone/>
+            <wp:docPr id="1126729422" name="Picture 1"/>
+            <wp:cNvGraphicFramePr>
+              <a:graphicFrameLocks xmlns:a="http://schemas.openxmlformats.org/drawingml/2006/main" noChangeAspect="1"/>
+            </wp:cNvGraphicFramePr>
+            <a:graphic xmlns:a="http://schemas.openxmlformats.org/drawingml/2006/main">
+              <a:graphicData uri="http://schemas.openxmlformats.org/drawingml/2006/picture">
+                <pic:pic xmlns:pic="http://schemas.openxmlformats.org/drawingml/2006/picture">
+                  <pic:nvPicPr>
+                    <pic:cNvPr id="1126729422" name=""/>
+                    <pic:cNvPicPr/>
+                  </pic:nvPicPr>
+                  <pic:blipFill>
+                    <a:blip r:embed="rId8"/>
+                    <a:stretch>
+                      <a:fillRect/>
+                    </a:stretch>
+                  </pic:blipFill>
+                  <pic:spPr>
+                    <a:xfrm>
+                      <a:off x="0" y="0"/>
+                      <a:ext cx="2779066" cy="1680692"/>
+                    </a:xfrm>
+                    <a:prstGeom prst="rect">
+                      <a:avLst/>
+                    </a:prstGeom>
+                  </pic:spPr>
+                </pic:pic>
+              </a:graphicData>
+            </a:graphic>
+            <wp14:sizeRelH relativeFrom="margin">
+              <wp14:pctWidth>0</wp14:pctWidth>
+            </wp14:sizeRelH>
+            <wp14:sizeRelV relativeFrom="margin">
+              <wp14:pctHeight>0</wp14:pctHeight>
+            </wp14:sizeRelV>
+          </wp:anchor>
+        </w:drawing>
+      </w:r>
+      <w:r>
+        <w:drawing>
+          <wp:anchor distT="0" distB="0" distL="114300" distR="114300" simplePos="0" relativeHeight="251762688" behindDoc="0" locked="0" layoutInCell="1" allowOverlap="1" wp14:anchorId="48586C7E" wp14:editId="62808F76">
+            <wp:simplePos x="0" y="0"/>
+            <wp:positionH relativeFrom="column">
+              <wp:posOffset>1644732</wp:posOffset>
+            </wp:positionH>
+            <wp:positionV relativeFrom="paragraph">
+              <wp:posOffset>7534894</wp:posOffset>
+            </wp:positionV>
+            <wp:extent cx="2802577" cy="777975"/>
+            <wp:effectExtent l="0" t="0" r="0" b="3175"/>
+            <wp:wrapNone/>
+            <wp:docPr id="982611858" name="Picture 1"/>
+            <wp:cNvGraphicFramePr>
+              <a:graphicFrameLocks xmlns:a="http://schemas.openxmlformats.org/drawingml/2006/main" noChangeAspect="1"/>
+            </wp:cNvGraphicFramePr>
+            <a:graphic xmlns:a="http://schemas.openxmlformats.org/drawingml/2006/main">
+              <a:graphicData uri="http://schemas.openxmlformats.org/drawingml/2006/picture">
+                <pic:pic xmlns:pic="http://schemas.openxmlformats.org/drawingml/2006/picture">
+                  <pic:nvPicPr>
+                    <pic:cNvPr id="982611858" name=""/>
+                    <pic:cNvPicPr/>
+                  </pic:nvPicPr>
+                  <pic:blipFill>
+                    <a:blip r:embed="rId9"/>
+                    <a:stretch>
+                      <a:fillRect/>
+                    </a:stretch>
+                  </pic:blipFill>
+                  <pic:spPr>
+                    <a:xfrm>
+                      <a:off x="0" y="0"/>
+                      <a:ext cx="2811653" cy="780494"/>
+                    </a:xfrm>
+                    <a:prstGeom prst="rect">
+                      <a:avLst/>
+                    </a:prstGeom>
+                  </pic:spPr>
+                </pic:pic>
+              </a:graphicData>
+            </a:graphic>
+            <wp14:sizeRelH relativeFrom="margin">
+              <wp14:pctWidth>0</wp14:pctWidth>
+            </wp14:sizeRelH>
+            <wp14:sizeRelV relativeFrom="margin">
+              <wp14:pctHeight>0</wp14:pctHeight>
+            </wp14:sizeRelV>
+          </wp:anchor>
+        </w:drawing>
+      </w:r>
+      <w:r>
+        <w:drawing>
+          <wp:anchor distT="0" distB="0" distL="114300" distR="114300" simplePos="0" relativeHeight="251757568" behindDoc="0" locked="0" layoutInCell="1" allowOverlap="1" wp14:anchorId="54CF469A" wp14:editId="5CC737CB">
+            <wp:simplePos x="0" y="0"/>
+            <wp:positionH relativeFrom="column">
+              <wp:posOffset>1679889</wp:posOffset>
+            </wp:positionH>
+            <wp:positionV relativeFrom="paragraph">
+              <wp:posOffset>7010400</wp:posOffset>
+            </wp:positionV>
+            <wp:extent cx="2476005" cy="506435"/>
+            <wp:effectExtent l="0" t="0" r="635" b="8255"/>
+            <wp:wrapNone/>
+            <wp:docPr id="1037043154" name="Picture 1"/>
+            <wp:cNvGraphicFramePr>
+              <a:graphicFrameLocks xmlns:a="http://schemas.openxmlformats.org/drawingml/2006/main" noChangeAspect="1"/>
+            </wp:cNvGraphicFramePr>
+            <a:graphic xmlns:a="http://schemas.openxmlformats.org/drawingml/2006/main">
+              <a:graphicData uri="http://schemas.openxmlformats.org/drawingml/2006/picture">
+                <pic:pic xmlns:pic="http://schemas.openxmlformats.org/drawingml/2006/picture">
+                  <pic:nvPicPr>
+                    <pic:cNvPr id="1037043154" name=""/>
+                    <pic:cNvPicPr/>
+                  </pic:nvPicPr>
+                  <pic:blipFill>
+                    <a:blip r:embed="rId10"/>
+                    <a:stretch>
+                      <a:fillRect/>
+                    </a:stretch>
+                  </pic:blipFill>
+                  <pic:spPr>
+                    <a:xfrm>
+                      <a:off x="0" y="0"/>
+                      <a:ext cx="2476005" cy="506435"/>
+                    </a:xfrm>
+                    <a:prstGeom prst="rect">
+                      <a:avLst/>
+                    </a:prstGeom>
+                  </pic:spPr>
+                </pic:pic>
+              </a:graphicData>
+            </a:graphic>
+            <wp14:sizeRelH relativeFrom="margin">
+              <wp14:pctWidth>0</wp14:pctWidth>
+            </wp14:sizeRelH>
+            <wp14:sizeRelV relativeFrom="margin">
+              <wp14:pctHeight>0</wp14:pctHeight>
+            </wp14:sizeRelV>
+          </wp:anchor>
+        </w:drawing>
+      </w:r>
+      <w:r>
+        <w:drawing>
+          <wp:anchor distT="0" distB="0" distL="114300" distR="114300" simplePos="0" relativeHeight="251755520" behindDoc="0" locked="0" layoutInCell="1" allowOverlap="1" wp14:anchorId="313D9C9C" wp14:editId="4290F724">
+            <wp:simplePos x="0" y="0"/>
+            <wp:positionH relativeFrom="page">
+              <wp:posOffset>2552923</wp:posOffset>
+            </wp:positionH>
+            <wp:positionV relativeFrom="paragraph">
+              <wp:posOffset>6748986</wp:posOffset>
+            </wp:positionV>
+            <wp:extent cx="1786243" cy="240613"/>
+            <wp:effectExtent l="0" t="0" r="5080" b="7620"/>
+            <wp:wrapNone/>
+            <wp:docPr id="2413493" name="Picture 1"/>
+            <wp:cNvGraphicFramePr>
+              <a:graphicFrameLocks xmlns:a="http://schemas.openxmlformats.org/drawingml/2006/main" noChangeAspect="1"/>
+            </wp:cNvGraphicFramePr>
+            <a:graphic xmlns:a="http://schemas.openxmlformats.org/drawingml/2006/main">
+              <a:graphicData uri="http://schemas.openxmlformats.org/drawingml/2006/picture">
+                <pic:pic xmlns:pic="http://schemas.openxmlformats.org/drawingml/2006/picture">
+                  <pic:nvPicPr>
+                    <pic:cNvPr id="2413493" name=""/>
+                    <pic:cNvPicPr/>
+                  </pic:nvPicPr>
+                  <pic:blipFill>
+                    <a:blip r:embed="rId11"/>
+                    <a:stretch>
+                      <a:fillRect/>
+                    </a:stretch>
+                  </pic:blipFill>
+                  <pic:spPr>
+                    <a:xfrm>
+                      <a:off x="0" y="0"/>
+                      <a:ext cx="1786243" cy="240613"/>
+                    </a:xfrm>
+                    <a:prstGeom prst="rect">
+                      <a:avLst/>
+                    </a:prstGeom>
+                  </pic:spPr>
+                </pic:pic>
+              </a:graphicData>
+            </a:graphic>
+            <wp14:sizeRelH relativeFrom="margin">
+              <wp14:pctWidth>0</wp14:pctWidth>
+            </wp14:sizeRelH>
+            <wp14:sizeRelV relativeFrom="margin">
+              <wp14:pctHeight>0</wp14:pctHeight>
+            </wp14:sizeRelV>
+          </wp:anchor>
+        </w:drawing>
+      </w:r>
+      <w:r>
+        <w:drawing>
+          <wp:anchor distT="0" distB="0" distL="114300" distR="114300" simplePos="0" relativeHeight="251753472" behindDoc="0" locked="0" layoutInCell="1" allowOverlap="1" wp14:anchorId="69C3349C" wp14:editId="638E7920">
+            <wp:simplePos x="0" y="0"/>
+            <wp:positionH relativeFrom="column">
+              <wp:posOffset>4080865</wp:posOffset>
+            </wp:positionH>
+            <wp:positionV relativeFrom="paragraph">
+              <wp:posOffset>5360934</wp:posOffset>
+            </wp:positionV>
+            <wp:extent cx="3107978" cy="1469958"/>
+            <wp:effectExtent l="0" t="0" r="0" b="0"/>
+            <wp:wrapNone/>
+            <wp:docPr id="135925003" name="Picture 1"/>
+            <wp:cNvGraphicFramePr>
+              <a:graphicFrameLocks xmlns:a="http://schemas.openxmlformats.org/drawingml/2006/main" noChangeAspect="1"/>
+            </wp:cNvGraphicFramePr>
+            <a:graphic xmlns:a="http://schemas.openxmlformats.org/drawingml/2006/main">
+              <a:graphicData uri="http://schemas.openxmlformats.org/drawingml/2006/picture">
+                <pic:pic xmlns:pic="http://schemas.openxmlformats.org/drawingml/2006/picture">
+                  <pic:nvPicPr>
+                    <pic:cNvPr id="135925003" name=""/>
+                    <pic:cNvPicPr/>
+                  </pic:nvPicPr>
+                  <pic:blipFill>
+                    <a:blip r:embed="rId12"/>
+                    <a:stretch>
+                      <a:fillRect/>
+                    </a:stretch>
+                  </pic:blipFill>
+                  <pic:spPr>
+                    <a:xfrm>
+                      <a:off x="0" y="0"/>
+                      <a:ext cx="3107978" cy="1469958"/>
+                    </a:xfrm>
+                    <a:prstGeom prst="rect">
+                      <a:avLst/>
+                    </a:prstGeom>
+                  </pic:spPr>
+                </pic:pic>
+              </a:graphicData>
+            </a:graphic>
+            <wp14:sizeRelH relativeFrom="margin">
+              <wp14:pctWidth>0</wp14:pctWidth>
+            </wp14:sizeRelH>
+            <wp14:sizeRelV relativeFrom="margin">
+              <wp14:pctHeight>0</wp14:pctHeight>
+            </wp14:sizeRelV>
+          </wp:anchor>
+        </w:drawing>
+      </w:r>
+      <w:r>
+        <w:drawing>
+          <wp:anchor distT="0" distB="0" distL="114300" distR="114300" simplePos="0" relativeHeight="251749376" behindDoc="0" locked="0" layoutInCell="1" allowOverlap="1" wp14:anchorId="32944D69" wp14:editId="5812DD26">
+            <wp:simplePos x="0" y="0"/>
+            <wp:positionH relativeFrom="margin">
+              <wp:posOffset>2974654</wp:posOffset>
+            </wp:positionH>
+            <wp:positionV relativeFrom="paragraph">
+              <wp:posOffset>5396931</wp:posOffset>
+            </wp:positionV>
+            <wp:extent cx="1453185" cy="997527"/>
+            <wp:effectExtent l="0" t="0" r="0" b="0"/>
+            <wp:wrapNone/>
+            <wp:docPr id="1964961024" name="Picture 1"/>
+            <wp:cNvGraphicFramePr>
+              <a:graphicFrameLocks xmlns:a="http://schemas.openxmlformats.org/drawingml/2006/main" noChangeAspect="1"/>
+            </wp:cNvGraphicFramePr>
+            <a:graphic xmlns:a="http://schemas.openxmlformats.org/drawingml/2006/main">
+              <a:graphicData uri="http://schemas.openxmlformats.org/drawingml/2006/picture">
+                <pic:pic xmlns:pic="http://schemas.openxmlformats.org/drawingml/2006/picture">
+                  <pic:nvPicPr>
+                    <pic:cNvPr id="1964961024" name=""/>
+                    <pic:cNvPicPr/>
+                  </pic:nvPicPr>
+                  <pic:blipFill>
+                    <a:blip r:embed="rId13"/>
+                    <a:stretch>
+                      <a:fillRect/>
+                    </a:stretch>
+                  </pic:blipFill>
+                  <pic:spPr>
+                    <a:xfrm>
+                      <a:off x="0" y="0"/>
+                      <a:ext cx="1453185" cy="997527"/>
+                    </a:xfrm>
+                    <a:prstGeom prst="rect">
+                      <a:avLst/>
+                    </a:prstGeom>
+                  </pic:spPr>
+                </pic:pic>
+              </a:graphicData>
+            </a:graphic>
+            <wp14:sizeRelH relativeFrom="margin">
+              <wp14:pctWidth>0</wp14:pctWidth>
+            </wp14:sizeRelH>
+            <wp14:sizeRelV relativeFrom="margin">
+              <wp14:pctHeight>0</wp14:pctHeight>
+            </wp14:sizeRelV>
+          </wp:anchor>
+        </w:drawing>
+      </w:r>
+      <w:r>
+        <w:drawing>
+          <wp:anchor distT="0" distB="0" distL="114300" distR="114300" simplePos="0" relativeHeight="251751424" behindDoc="0" locked="0" layoutInCell="1" allowOverlap="1" wp14:anchorId="269BE5CE" wp14:editId="44F649FE">
+            <wp:simplePos x="0" y="0"/>
+            <wp:positionH relativeFrom="margin">
+              <wp:posOffset>4898571</wp:posOffset>
+            </wp:positionH>
+            <wp:positionV relativeFrom="paragraph">
+              <wp:posOffset>5029200</wp:posOffset>
+            </wp:positionV>
+            <wp:extent cx="1951714" cy="277495"/>
+            <wp:effectExtent l="0" t="0" r="0" b="8255"/>
+            <wp:wrapNone/>
+            <wp:docPr id="565023780" name="Picture 1"/>
+            <wp:cNvGraphicFramePr>
+              <a:graphicFrameLocks xmlns:a="http://schemas.openxmlformats.org/drawingml/2006/main" noChangeAspect="1"/>
+            </wp:cNvGraphicFramePr>
+            <a:graphic xmlns:a="http://schemas.openxmlformats.org/drawingml/2006/main">
+              <a:graphicData uri="http://schemas.openxmlformats.org/drawingml/2006/picture">
+                <pic:pic xmlns:pic="http://schemas.openxmlformats.org/drawingml/2006/picture">
+                  <pic:nvPicPr>
+                    <pic:cNvPr id="565023780" name=""/>
+                    <pic:cNvPicPr/>
+                  </pic:nvPicPr>
+                  <pic:blipFill>
+                    <a:blip r:embed="rId14"/>
+                    <a:stretch>
+                      <a:fillRect/>
+                    </a:stretch>
+                  </pic:blipFill>
+                  <pic:spPr>
+                    <a:xfrm>
+                      <a:off x="0" y="0"/>
+                      <a:ext cx="1976233" cy="280981"/>
+                    </a:xfrm>
+                    <a:prstGeom prst="rect">
+                      <a:avLst/>
+                    </a:prstGeom>
+                  </pic:spPr>
+                </pic:pic>
+              </a:graphicData>
+            </a:graphic>
+            <wp14:sizeRelH relativeFrom="margin">
+              <wp14:pctWidth>0</wp14:pctWidth>
+            </wp14:sizeRelH>
+            <wp14:sizeRelV relativeFrom="margin">
+              <wp14:pctHeight>0</wp14:pctHeight>
+            </wp14:sizeRelV>
+          </wp:anchor>
+        </w:drawing>
+      </w:r>
+      <w:r>
+        <w:drawing>
+          <wp:anchor distT="0" distB="0" distL="114300" distR="114300" simplePos="0" relativeHeight="251747328" behindDoc="0" locked="0" layoutInCell="1" allowOverlap="1" wp14:anchorId="2B31AB8F" wp14:editId="3FA42F2F">
+            <wp:simplePos x="0" y="0"/>
+            <wp:positionH relativeFrom="column">
+              <wp:posOffset>2998263</wp:posOffset>
+            </wp:positionH>
+            <wp:positionV relativeFrom="paragraph">
+              <wp:posOffset>5025003</wp:posOffset>
+            </wp:positionV>
+            <wp:extent cx="1827724" cy="254630"/>
+            <wp:effectExtent l="0" t="0" r="1270" b="0"/>
+            <wp:wrapNone/>
+            <wp:docPr id="174792678" name="Picture 1"/>
+            <wp:cNvGraphicFramePr>
+              <a:graphicFrameLocks xmlns:a="http://schemas.openxmlformats.org/drawingml/2006/main" noChangeAspect="1"/>
+            </wp:cNvGraphicFramePr>
+            <a:graphic xmlns:a="http://schemas.openxmlformats.org/drawingml/2006/main">
+              <a:graphicData uri="http://schemas.openxmlformats.org/drawingml/2006/picture">
+                <pic:pic xmlns:pic="http://schemas.openxmlformats.org/drawingml/2006/picture">
+                  <pic:nvPicPr>
+                    <pic:cNvPr id="174792678" name=""/>
+                    <pic:cNvPicPr/>
+                  </pic:nvPicPr>
+                  <pic:blipFill>
+                    <a:blip r:embed="rId15"/>
+                    <a:stretch>
+                      <a:fillRect/>
+                    </a:stretch>
+                  </pic:blipFill>
+                  <pic:spPr>
+                    <a:xfrm>
+                      <a:off x="0" y="0"/>
+                      <a:ext cx="1827724" cy="254630"/>
+                    </a:xfrm>
+                    <a:prstGeom prst="rect">
+                      <a:avLst/>
+                    </a:prstGeom>
+                  </pic:spPr>
+                </pic:pic>
+              </a:graphicData>
+            </a:graphic>
+            <wp14:sizeRelH relativeFrom="margin">
+              <wp14:pctWidth>0</wp14:pctWidth>
+            </wp14:sizeRelH>
+            <wp14:sizeRelV relativeFrom="margin">
+              <wp14:pctHeight>0</wp14:pctHeight>
+            </wp14:sizeRelV>
+          </wp:anchor>
+        </w:drawing>
+      </w:r>
+      <w:r>
+        <w:drawing>
+          <wp:anchor distT="0" distB="0" distL="114300" distR="114300" simplePos="0" relativeHeight="251767808" behindDoc="0" locked="0" layoutInCell="1" allowOverlap="1" wp14:anchorId="362E1545" wp14:editId="2D137776">
+            <wp:simplePos x="0" y="0"/>
+            <wp:positionH relativeFrom="column">
+              <wp:posOffset>-389105</wp:posOffset>
+            </wp:positionH>
+            <wp:positionV relativeFrom="paragraph">
+              <wp:posOffset>8735438</wp:posOffset>
+            </wp:positionV>
+            <wp:extent cx="2616740" cy="357379"/>
+            <wp:effectExtent l="0" t="0" r="0" b="5080"/>
+            <wp:wrapNone/>
+            <wp:docPr id="773741034" name="Picture 1"/>
+            <wp:cNvGraphicFramePr>
+              <a:graphicFrameLocks xmlns:a="http://schemas.openxmlformats.org/drawingml/2006/main" noChangeAspect="1"/>
+            </wp:cNvGraphicFramePr>
+            <a:graphic xmlns:a="http://schemas.openxmlformats.org/drawingml/2006/main">
+              <a:graphicData uri="http://schemas.openxmlformats.org/drawingml/2006/picture">
+                <pic:pic xmlns:pic="http://schemas.openxmlformats.org/drawingml/2006/picture">
+                  <pic:nvPicPr>
+                    <pic:cNvPr id="773741034" name=""/>
+                    <pic:cNvPicPr/>
+                  </pic:nvPicPr>
+                  <pic:blipFill>
+                    <a:blip r:embed="rId16"/>
+                    <a:stretch>
+                      <a:fillRect/>
+                    </a:stretch>
+                  </pic:blipFill>
+                  <pic:spPr>
+                    <a:xfrm>
+                      <a:off x="0" y="0"/>
+                      <a:ext cx="2695505" cy="368136"/>
+                    </a:xfrm>
+                    <a:prstGeom prst="rect">
+                      <a:avLst/>
+                    </a:prstGeom>
+                  </pic:spPr>
+                </pic:pic>
+              </a:graphicData>
+            </a:graphic>
+            <wp14:sizeRelH relativeFrom="margin">
+              <wp14:pctWidth>0</wp14:pctWidth>
+            </wp14:sizeRelH>
+            <wp14:sizeRelV relativeFrom="margin">
+              <wp14:pctHeight>0</wp14:pctHeight>
+            </wp14:sizeRelV>
+          </wp:anchor>
+        </w:drawing>
+      </w:r>
+      <w:r>
+        <w:drawing>
+          <wp:anchor distT="0" distB="0" distL="114300" distR="114300" simplePos="0" relativeHeight="251743232" behindDoc="0" locked="0" layoutInCell="1" allowOverlap="1" wp14:anchorId="42209E96" wp14:editId="30069CC0">
+            <wp:simplePos x="0" y="0"/>
+            <wp:positionH relativeFrom="column">
+              <wp:posOffset>124704</wp:posOffset>
+            </wp:positionH>
+            <wp:positionV relativeFrom="paragraph">
+              <wp:posOffset>8384986</wp:posOffset>
+            </wp:positionV>
+            <wp:extent cx="1850830" cy="319391"/>
+            <wp:effectExtent l="0" t="0" r="0" b="5080"/>
+            <wp:wrapNone/>
+            <wp:docPr id="402354240" name="Picture 1"/>
+            <wp:cNvGraphicFramePr>
+              <a:graphicFrameLocks xmlns:a="http://schemas.openxmlformats.org/drawingml/2006/main" noChangeAspect="1"/>
+            </wp:cNvGraphicFramePr>
+            <a:graphic xmlns:a="http://schemas.openxmlformats.org/drawingml/2006/main">
+              <a:graphicData uri="http://schemas.openxmlformats.org/drawingml/2006/picture">
+                <pic:pic xmlns:pic="http://schemas.openxmlformats.org/drawingml/2006/picture">
+                  <pic:nvPicPr>
+                    <pic:cNvPr id="402354240" name=""/>
+                    <pic:cNvPicPr/>
+                  </pic:nvPicPr>
+                  <pic:blipFill>
+                    <a:blip r:embed="rId17"/>
+                    <a:stretch>
+                      <a:fillRect/>
+                    </a:stretch>
+                  </pic:blipFill>
+                  <pic:spPr>
+                    <a:xfrm>
+                      <a:off x="0" y="0"/>
+                      <a:ext cx="1850830" cy="319391"/>
+                    </a:xfrm>
+                    <a:prstGeom prst="rect">
+                      <a:avLst/>
+                    </a:prstGeom>
+                  </pic:spPr>
+                </pic:pic>
+              </a:graphicData>
+            </a:graphic>
+            <wp14:sizeRelH relativeFrom="margin">
+              <wp14:pctWidth>0</wp14:pctWidth>
+            </wp14:sizeRelH>
+            <wp14:sizeRelV relativeFrom="margin">
+              <wp14:pctHeight>0</wp14:pctHeight>
+            </wp14:sizeRelV>
+          </wp:anchor>
+        </w:drawing>
+      </w:r>
+      <w:r>
+        <w:drawing>
+          <wp:anchor distT="0" distB="0" distL="114300" distR="114300" simplePos="0" relativeHeight="251741184" behindDoc="0" locked="0" layoutInCell="1" allowOverlap="1" wp14:anchorId="0B2EF31C" wp14:editId="38BD4F06">
+            <wp:simplePos x="0" y="0"/>
+            <wp:positionH relativeFrom="column">
+              <wp:posOffset>-223736</wp:posOffset>
+            </wp:positionH>
+            <wp:positionV relativeFrom="paragraph">
+              <wp:posOffset>7723762</wp:posOffset>
+            </wp:positionV>
+            <wp:extent cx="1820722" cy="622570"/>
+            <wp:effectExtent l="0" t="0" r="8255" b="6350"/>
+            <wp:wrapNone/>
+            <wp:docPr id="1113205981" name="Picture 1"/>
+            <wp:cNvGraphicFramePr>
+              <a:graphicFrameLocks xmlns:a="http://schemas.openxmlformats.org/drawingml/2006/main" noChangeAspect="1"/>
+            </wp:cNvGraphicFramePr>
+            <a:graphic xmlns:a="http://schemas.openxmlformats.org/drawingml/2006/main">
+              <a:graphicData uri="http://schemas.openxmlformats.org/drawingml/2006/picture">
+                <pic:pic xmlns:pic="http://schemas.openxmlformats.org/drawingml/2006/picture">
+                  <pic:nvPicPr>
+                    <pic:cNvPr id="1113205981" name=""/>
+                    <pic:cNvPicPr/>
+                  </pic:nvPicPr>
+                  <pic:blipFill>
+                    <a:blip r:embed="rId18"/>
+                    <a:stretch>
+                      <a:fillRect/>
+                    </a:stretch>
+                  </pic:blipFill>
+                  <pic:spPr>
+                    <a:xfrm>
+                      <a:off x="0" y="0"/>
+                      <a:ext cx="1831427" cy="626231"/>
+                    </a:xfrm>
+                    <a:prstGeom prst="rect">
+                      <a:avLst/>
+                    </a:prstGeom>
+                  </pic:spPr>
+                </pic:pic>
+              </a:graphicData>
+            </a:graphic>
+            <wp14:sizeRelH relativeFrom="margin">
+              <wp14:pctWidth>0</wp14:pctWidth>
+            </wp14:sizeRelH>
+            <wp14:sizeRelV relativeFrom="margin">
+              <wp14:pctHeight>0</wp14:pctHeight>
+            </wp14:sizeRelV>
+          </wp:anchor>
+        </w:drawing>
+      </w:r>
+      <w:r>
+        <w:drawing>
+          <wp:anchor distT="0" distB="0" distL="114300" distR="114300" simplePos="0" relativeHeight="251739136" behindDoc="0" locked="0" layoutInCell="1" allowOverlap="1" wp14:anchorId="67E23EF5" wp14:editId="043F1079">
+            <wp:simplePos x="0" y="0"/>
+            <wp:positionH relativeFrom="column">
+              <wp:posOffset>-252919</wp:posOffset>
+            </wp:positionH>
+            <wp:positionV relativeFrom="paragraph">
+              <wp:posOffset>5457218</wp:posOffset>
+            </wp:positionV>
+            <wp:extent cx="1304342" cy="142416"/>
+            <wp:effectExtent l="0" t="0" r="0" b="0"/>
+            <wp:wrapNone/>
+            <wp:docPr id="713196198" name="Picture 1"/>
+            <wp:cNvGraphicFramePr>
+              <a:graphicFrameLocks xmlns:a="http://schemas.openxmlformats.org/drawingml/2006/main" noChangeAspect="1"/>
+            </wp:cNvGraphicFramePr>
+            <a:graphic xmlns:a="http://schemas.openxmlformats.org/drawingml/2006/main">
+              <a:graphicData uri="http://schemas.openxmlformats.org/drawingml/2006/picture">
+                <pic:pic xmlns:pic="http://schemas.openxmlformats.org/drawingml/2006/picture">
+                  <pic:nvPicPr>
+                    <pic:cNvPr id="713196198" name=""/>
+                    <pic:cNvPicPr/>
+                  </pic:nvPicPr>
+                  <pic:blipFill>
+                    <a:blip r:embed="rId19"/>
+                    <a:stretch>
+                      <a:fillRect/>
+                    </a:stretch>
+                  </pic:blipFill>
+                  <pic:spPr>
+                    <a:xfrm>
+                      <a:off x="0" y="0"/>
+                      <a:ext cx="1316236" cy="143715"/>
+                    </a:xfrm>
+                    <a:prstGeom prst="rect">
+                      <a:avLst/>
+                    </a:prstGeom>
+                  </pic:spPr>
+                </pic:pic>
+              </a:graphicData>
+            </a:graphic>
+            <wp14:sizeRelH relativeFrom="margin">
+              <wp14:pctWidth>0</wp14:pctWidth>
+            </wp14:sizeRelH>
+            <wp14:sizeRelV relativeFrom="margin">
+              <wp14:pctHeight>0</wp14:pctHeight>
+            </wp14:sizeRelV>
+          </wp:anchor>
+        </w:drawing>
+      </w:r>
+      <w:r>
+        <w:rPr>
+          <w:noProof/>
+        </w:rPr>
+        <w:drawing>
+          <wp:anchor distT="0" distB="0" distL="114300" distR="114300" simplePos="0" relativeHeight="251737088" behindDoc="0" locked="0" layoutInCell="1" allowOverlap="1" wp14:anchorId="355E4E0C" wp14:editId="230D3D65">
+            <wp:simplePos x="0" y="0"/>
+            <wp:positionH relativeFrom="column">
+              <wp:posOffset>-224487</wp:posOffset>
+            </wp:positionH>
+            <wp:positionV relativeFrom="paragraph">
+              <wp:posOffset>5653932</wp:posOffset>
+            </wp:positionV>
+            <wp:extent cx="3164867" cy="2016714"/>
+            <wp:effectExtent l="0" t="0" r="0" b="3175"/>
+            <wp:wrapNone/>
+            <wp:docPr id="1992757296" name="Picture 3"/>
+            <wp:cNvGraphicFramePr>
+              <a:graphicFrameLocks xmlns:a="http://schemas.openxmlformats.org/drawingml/2006/main" noChangeAspect="1"/>
+            </wp:cNvGraphicFramePr>
+            <a:graphic xmlns:a="http://schemas.openxmlformats.org/drawingml/2006/main">
+              <a:graphicData uri="http://schemas.openxmlformats.org/drawingml/2006/picture">
+                <pic:pic xmlns:pic="http://schemas.openxmlformats.org/drawingml/2006/picture">
+                  <pic:nvPicPr>
+                    <pic:cNvPr id="0" name="Picture 88"/>
+                    <pic:cNvPicPr>
+                      <a:picLocks noChangeAspect="1" noChangeArrowheads="1"/>
+                    </pic:cNvPicPr>
+                  </pic:nvPicPr>
+                  <pic:blipFill>
+                    <a:blip r:embed="rId20">
+                      <a:extLst>
+                        <a:ext uri="{28A0092B-C50C-407E-A947-70E740481C1C}">
+                          <a14:useLocalDpi xmlns:a14="http://schemas.microsoft.com/office/drawing/2010/main" val="0"/>
+                        </a:ext>
+                      </a:extLst>
+                    </a:blip>
+                    <a:srcRect/>
+                    <a:stretch>
+                      <a:fillRect/>
+                    </a:stretch>
+                  </pic:blipFill>
+                  <pic:spPr bwMode="auto">
+                    <a:xfrm>
+                      <a:off x="0" y="0"/>
+                      <a:ext cx="3164867" cy="2016714"/>
+                    </a:xfrm>
+                    <a:prstGeom prst="rect">
+                      <a:avLst/>
+                    </a:prstGeom>
+                    <a:noFill/>
+                    <a:ln>
+                      <a:noFill/>
+                    </a:ln>
+                  </pic:spPr>
+                </pic:pic>
+              </a:graphicData>
+            </a:graphic>
+            <wp14:sizeRelH relativeFrom="page">
+              <wp14:pctWidth>0</wp14:pctWidth>
+            </wp14:sizeRelH>
+            <wp14:sizeRelV relativeFrom="page">
+              <wp14:pctHeight>0</wp14:pctHeight>
+            </wp14:sizeRelV>
+          </wp:anchor>
+        </w:drawing>
+      </w:r>
+      <w:r>
+        <w:drawing>
+          <wp:anchor distT="0" distB="0" distL="114300" distR="114300" simplePos="0" relativeHeight="251735040" behindDoc="0" locked="0" layoutInCell="1" allowOverlap="1" wp14:anchorId="27B5D000" wp14:editId="48B60B7C">
+            <wp:simplePos x="0" y="0"/>
+            <wp:positionH relativeFrom="column">
+              <wp:posOffset>1867711</wp:posOffset>
+            </wp:positionH>
+            <wp:positionV relativeFrom="paragraph">
+              <wp:posOffset>4581728</wp:posOffset>
+            </wp:positionV>
+            <wp:extent cx="690663" cy="157926"/>
+            <wp:effectExtent l="0" t="0" r="0" b="0"/>
+            <wp:wrapNone/>
+            <wp:docPr id="1874829721" name="Picture 1"/>
+            <wp:cNvGraphicFramePr>
+              <a:graphicFrameLocks xmlns:a="http://schemas.openxmlformats.org/drawingml/2006/main" noChangeAspect="1"/>
+            </wp:cNvGraphicFramePr>
+            <a:graphic xmlns:a="http://schemas.openxmlformats.org/drawingml/2006/main">
+              <a:graphicData uri="http://schemas.openxmlformats.org/drawingml/2006/picture">
+                <pic:pic xmlns:pic="http://schemas.openxmlformats.org/drawingml/2006/picture">
+                  <pic:nvPicPr>
+                    <pic:cNvPr id="1874829721" name=""/>
+                    <pic:cNvPicPr/>
+                  </pic:nvPicPr>
+                  <pic:blipFill>
+                    <a:blip r:embed="rId21"/>
+                    <a:stretch>
+                      <a:fillRect/>
+                    </a:stretch>
+                  </pic:blipFill>
+                  <pic:spPr>
+                    <a:xfrm>
+                      <a:off x="0" y="0"/>
+                      <a:ext cx="699689" cy="159990"/>
+                    </a:xfrm>
+                    <a:prstGeom prst="rect">
+                      <a:avLst/>
+                    </a:prstGeom>
+                  </pic:spPr>
+                </pic:pic>
+              </a:graphicData>
+            </a:graphic>
+            <wp14:sizeRelH relativeFrom="margin">
+              <wp14:pctWidth>0</wp14:pctWidth>
+            </wp14:sizeRelH>
+            <wp14:sizeRelV relativeFrom="margin">
+              <wp14:pctHeight>0</wp14:pctHeight>
+            </wp14:sizeRelV>
+          </wp:anchor>
+        </w:drawing>
+      </w:r>
+      <w:r>
+        <w:drawing>
+          <wp:anchor distT="0" distB="0" distL="114300" distR="114300" simplePos="0" relativeHeight="251657214" behindDoc="0" locked="0" layoutInCell="1" allowOverlap="1" wp14:anchorId="170469BC" wp14:editId="075AC181">
+            <wp:simplePos x="0" y="0"/>
+            <wp:positionH relativeFrom="column">
+              <wp:posOffset>940560</wp:posOffset>
+            </wp:positionH>
+            <wp:positionV relativeFrom="paragraph">
+              <wp:posOffset>4499854</wp:posOffset>
+            </wp:positionV>
+            <wp:extent cx="2013626" cy="1154479"/>
+            <wp:effectExtent l="0" t="0" r="5715" b="7620"/>
+            <wp:wrapNone/>
+            <wp:docPr id="1834347637" name="Picture 1"/>
+            <wp:cNvGraphicFramePr>
+              <a:graphicFrameLocks xmlns:a="http://schemas.openxmlformats.org/drawingml/2006/main" noChangeAspect="1"/>
+            </wp:cNvGraphicFramePr>
+            <a:graphic xmlns:a="http://schemas.openxmlformats.org/drawingml/2006/main">
+              <a:graphicData uri="http://schemas.openxmlformats.org/drawingml/2006/picture">
+                <pic:pic xmlns:pic="http://schemas.openxmlformats.org/drawingml/2006/picture">
+                  <pic:nvPicPr>
+                    <pic:cNvPr id="1834347637" name=""/>
+                    <pic:cNvPicPr/>
+                  </pic:nvPicPr>
+                  <pic:blipFill>
+                    <a:blip r:embed="rId22"/>
+                    <a:stretch>
+                      <a:fillRect/>
+                    </a:stretch>
+                  </pic:blipFill>
+                  <pic:spPr>
+                    <a:xfrm>
+                      <a:off x="0" y="0"/>
+                      <a:ext cx="2013626" cy="1154479"/>
+                    </a:xfrm>
+                    <a:prstGeom prst="rect">
+                      <a:avLst/>
+                    </a:prstGeom>
+                  </pic:spPr>
+                </pic:pic>
+              </a:graphicData>
+            </a:graphic>
+            <wp14:sizeRelH relativeFrom="margin">
+              <wp14:pctWidth>0</wp14:pctWidth>
+            </wp14:sizeRelH>
+            <wp14:sizeRelV relativeFrom="margin">
+              <wp14:pctHeight>0</wp14:pctHeight>
+            </wp14:sizeRelV>
+          </wp:anchor>
+        </w:drawing>
+      </w:r>
+      <w:r>
+        <w:drawing>
+          <wp:anchor distT="0" distB="0" distL="114300" distR="114300" simplePos="0" relativeHeight="251731968" behindDoc="0" locked="0" layoutInCell="1" allowOverlap="1" wp14:anchorId="6B1AA5C3" wp14:editId="21BD985B">
+            <wp:simplePos x="0" y="0"/>
+            <wp:positionH relativeFrom="column">
+              <wp:posOffset>-388512</wp:posOffset>
+            </wp:positionH>
+            <wp:positionV relativeFrom="paragraph">
+              <wp:posOffset>4562273</wp:posOffset>
+            </wp:positionV>
+            <wp:extent cx="1740156" cy="237912"/>
+            <wp:effectExtent l="0" t="0" r="0" b="0"/>
+            <wp:wrapNone/>
+            <wp:docPr id="213963491" name="Picture 1"/>
+            <wp:cNvGraphicFramePr>
+              <a:graphicFrameLocks xmlns:a="http://schemas.openxmlformats.org/drawingml/2006/main" noChangeAspect="1"/>
+            </wp:cNvGraphicFramePr>
+            <a:graphic xmlns:a="http://schemas.openxmlformats.org/drawingml/2006/main">
+              <a:graphicData uri="http://schemas.openxmlformats.org/drawingml/2006/picture">
+                <pic:pic xmlns:pic="http://schemas.openxmlformats.org/drawingml/2006/picture">
+                  <pic:nvPicPr>
+                    <pic:cNvPr id="213963491" name=""/>
+                    <pic:cNvPicPr/>
+                  </pic:nvPicPr>
+                  <pic:blipFill>
+                    <a:blip r:embed="rId23"/>
+                    <a:stretch>
+                      <a:fillRect/>
+                    </a:stretch>
+                  </pic:blipFill>
+                  <pic:spPr>
+                    <a:xfrm>
+                      <a:off x="0" y="0"/>
+                      <a:ext cx="1740156" cy="237912"/>
+                    </a:xfrm>
+                    <a:prstGeom prst="rect">
+                      <a:avLst/>
+                    </a:prstGeom>
+                  </pic:spPr>
+                </pic:pic>
+              </a:graphicData>
+            </a:graphic>
+            <wp14:sizeRelH relativeFrom="margin">
+              <wp14:pctWidth>0</wp14:pctWidth>
+            </wp14:sizeRelH>
+            <wp14:sizeRelV relativeFrom="margin">
+              <wp14:pctHeight>0</wp14:pctHeight>
+            </wp14:sizeRelV>
+          </wp:anchor>
+        </w:drawing>
+      </w:r>
+      <w:r>
+        <w:drawing>
+          <wp:anchor distT="0" distB="0" distL="114300" distR="114300" simplePos="0" relativeHeight="251719680" behindDoc="0" locked="0" layoutInCell="1" allowOverlap="1" wp14:anchorId="16C2F352" wp14:editId="6F619027">
+            <wp:simplePos x="0" y="0"/>
+            <wp:positionH relativeFrom="margin">
+              <wp:align>right</wp:align>
+            </wp:positionH>
+            <wp:positionV relativeFrom="paragraph">
+              <wp:posOffset>2393004</wp:posOffset>
+            </wp:positionV>
+            <wp:extent cx="1867710" cy="1063625"/>
+            <wp:effectExtent l="0" t="0" r="0" b="3175"/>
+            <wp:wrapNone/>
+            <wp:docPr id="187414621" name="Picture 1"/>
+            <wp:cNvGraphicFramePr>
+              <a:graphicFrameLocks xmlns:a="http://schemas.openxmlformats.org/drawingml/2006/main" noChangeAspect="1"/>
+            </wp:cNvGraphicFramePr>
+            <a:graphic xmlns:a="http://schemas.openxmlformats.org/drawingml/2006/main">
+              <a:graphicData uri="http://schemas.openxmlformats.org/drawingml/2006/picture">
+                <pic:pic xmlns:pic="http://schemas.openxmlformats.org/drawingml/2006/picture">
+                  <pic:nvPicPr>
+                    <pic:cNvPr id="187414621" name=""/>
+                    <pic:cNvPicPr/>
+                  </pic:nvPicPr>
+                  <pic:blipFill>
+                    <a:blip r:embed="rId24"/>
+                    <a:stretch>
+                      <a:fillRect/>
+                    </a:stretch>
+                  </pic:blipFill>
+                  <pic:spPr>
+                    <a:xfrm>
+                      <a:off x="0" y="0"/>
+                      <a:ext cx="1867710" cy="1063625"/>
+                    </a:xfrm>
+                    <a:prstGeom prst="rect">
+                      <a:avLst/>
+                    </a:prstGeom>
+                  </pic:spPr>
+                </pic:pic>
+              </a:graphicData>
+            </a:graphic>
+            <wp14:sizeRelH relativeFrom="margin">
+              <wp14:pctWidth>0</wp14:pctWidth>
+            </wp14:sizeRelH>
+            <wp14:sizeRelV relativeFrom="margin">
+              <wp14:pctHeight>0</wp14:pctHeight>
+            </wp14:sizeRelV>
+          </wp:anchor>
+        </w:drawing>
+      </w:r>
+      <w:r>
+        <w:drawing>
+          <wp:anchor distT="0" distB="0" distL="114300" distR="114300" simplePos="0" relativeHeight="251721728" behindDoc="0" locked="0" layoutInCell="1" allowOverlap="1" wp14:anchorId="2A853DEC" wp14:editId="575277AA">
+            <wp:simplePos x="0" y="0"/>
+            <wp:positionH relativeFrom="column">
+              <wp:posOffset>4590806</wp:posOffset>
+            </wp:positionH>
+            <wp:positionV relativeFrom="paragraph">
+              <wp:posOffset>2395274</wp:posOffset>
+            </wp:positionV>
+            <wp:extent cx="392716" cy="147820"/>
+            <wp:effectExtent l="0" t="0" r="7620" b="5080"/>
+            <wp:wrapNone/>
+            <wp:docPr id="1410597909" name="Picture 1"/>
+            <wp:cNvGraphicFramePr>
+              <a:graphicFrameLocks xmlns:a="http://schemas.openxmlformats.org/drawingml/2006/main" noChangeAspect="1"/>
+            </wp:cNvGraphicFramePr>
+            <a:graphic xmlns:a="http://schemas.openxmlformats.org/drawingml/2006/main">
+              <a:graphicData uri="http://schemas.openxmlformats.org/drawingml/2006/picture">
+                <pic:pic xmlns:pic="http://schemas.openxmlformats.org/drawingml/2006/picture">
+                  <pic:nvPicPr>
+                    <pic:cNvPr id="1410597909" name=""/>
+                    <pic:cNvPicPr/>
+                  </pic:nvPicPr>
+                  <pic:blipFill>
+                    <a:blip r:embed="rId25"/>
+                    <a:stretch>
+                      <a:fillRect/>
+                    </a:stretch>
+                  </pic:blipFill>
+                  <pic:spPr>
+                    <a:xfrm>
+                      <a:off x="0" y="0"/>
+                      <a:ext cx="396064" cy="149080"/>
+                    </a:xfrm>
+                    <a:prstGeom prst="rect">
+                      <a:avLst/>
+                    </a:prstGeom>
+                  </pic:spPr>
+                </pic:pic>
+              </a:graphicData>
+            </a:graphic>
+            <wp14:sizeRelH relativeFrom="margin">
+              <wp14:pctWidth>0</wp14:pctWidth>
+            </wp14:sizeRelH>
+            <wp14:sizeRelV relativeFrom="margin">
+              <wp14:pctHeight>0</wp14:pctHeight>
+            </wp14:sizeRelV>
+          </wp:anchor>
+        </w:drawing>
+      </w:r>
+      <w:r>
+        <w:drawing>
+          <wp:anchor distT="0" distB="0" distL="114300" distR="114300" simplePos="0" relativeHeight="251726848" behindDoc="0" locked="0" layoutInCell="1" allowOverlap="1" wp14:anchorId="2B40ECB5" wp14:editId="49653C3E">
+            <wp:simplePos x="0" y="0"/>
+            <wp:positionH relativeFrom="margin">
+              <wp:posOffset>5155660</wp:posOffset>
+            </wp:positionH>
+            <wp:positionV relativeFrom="paragraph">
+              <wp:posOffset>1138136</wp:posOffset>
+            </wp:positionV>
+            <wp:extent cx="2013625" cy="1235075"/>
+            <wp:effectExtent l="0" t="0" r="5715" b="3175"/>
+            <wp:wrapNone/>
+            <wp:docPr id="1433098114" name="Picture 1"/>
+            <wp:cNvGraphicFramePr>
+              <a:graphicFrameLocks xmlns:a="http://schemas.openxmlformats.org/drawingml/2006/main" noChangeAspect="1"/>
+            </wp:cNvGraphicFramePr>
+            <a:graphic xmlns:a="http://schemas.openxmlformats.org/drawingml/2006/main">
+              <a:graphicData uri="http://schemas.openxmlformats.org/drawingml/2006/picture">
+                <pic:pic xmlns:pic="http://schemas.openxmlformats.org/drawingml/2006/picture">
+                  <pic:nvPicPr>
+                    <pic:cNvPr id="1433098114" name=""/>
+                    <pic:cNvPicPr/>
+                  </pic:nvPicPr>
+                  <pic:blipFill>
+                    <a:blip r:embed="rId26"/>
+                    <a:stretch>
+                      <a:fillRect/>
+                    </a:stretch>
+                  </pic:blipFill>
+                  <pic:spPr>
+                    <a:xfrm>
+                      <a:off x="0" y="0"/>
+                      <a:ext cx="2013625" cy="1235075"/>
+                    </a:xfrm>
+                    <a:prstGeom prst="rect">
+                      <a:avLst/>
+                    </a:prstGeom>
+                  </pic:spPr>
+                </pic:pic>
+              </a:graphicData>
+            </a:graphic>
+            <wp14:sizeRelH relativeFrom="margin">
+              <wp14:pctWidth>0</wp14:pctWidth>
+            </wp14:sizeRelH>
+            <wp14:sizeRelV relativeFrom="margin">
+              <wp14:pctHeight>0</wp14:pctHeight>
+            </wp14:sizeRelV>
+          </wp:anchor>
+        </w:drawing>
+      </w:r>
+      <w:r>
+        <w:drawing>
+          <wp:anchor distT="0" distB="0" distL="114300" distR="114300" simplePos="0" relativeHeight="251728896" behindDoc="0" locked="0" layoutInCell="1" allowOverlap="1" wp14:anchorId="6822718F" wp14:editId="49008091">
+            <wp:simplePos x="0" y="0"/>
+            <wp:positionH relativeFrom="column">
+              <wp:posOffset>3800123</wp:posOffset>
+            </wp:positionH>
+            <wp:positionV relativeFrom="paragraph">
+              <wp:posOffset>3748783</wp:posOffset>
+            </wp:positionV>
+            <wp:extent cx="376947" cy="148917"/>
+            <wp:effectExtent l="0" t="0" r="4445" b="3810"/>
+            <wp:wrapNone/>
+            <wp:docPr id="493972183" name="Picture 1"/>
+            <wp:cNvGraphicFramePr>
+              <a:graphicFrameLocks xmlns:a="http://schemas.openxmlformats.org/drawingml/2006/main" noChangeAspect="1"/>
+            </wp:cNvGraphicFramePr>
+            <a:graphic xmlns:a="http://schemas.openxmlformats.org/drawingml/2006/main">
+              <a:graphicData uri="http://schemas.openxmlformats.org/drawingml/2006/picture">
+                <pic:pic xmlns:pic="http://schemas.openxmlformats.org/drawingml/2006/picture">
+                  <pic:nvPicPr>
+                    <pic:cNvPr id="493972183" name=""/>
+                    <pic:cNvPicPr/>
+                  </pic:nvPicPr>
+                  <pic:blipFill>
+                    <a:blip r:embed="rId27"/>
+                    <a:stretch>
+                      <a:fillRect/>
+                    </a:stretch>
+                  </pic:blipFill>
+                  <pic:spPr>
+                    <a:xfrm>
+                      <a:off x="0" y="0"/>
+                      <a:ext cx="376947" cy="148917"/>
+                    </a:xfrm>
+                    <a:prstGeom prst="rect">
+                      <a:avLst/>
+                    </a:prstGeom>
+                  </pic:spPr>
+                </pic:pic>
+              </a:graphicData>
+            </a:graphic>
+            <wp14:sizeRelH relativeFrom="margin">
+              <wp14:pctWidth>0</wp14:pctWidth>
+            </wp14:sizeRelH>
+            <wp14:sizeRelV relativeFrom="margin">
+              <wp14:pctHeight>0</wp14:pctHeight>
+            </wp14:sizeRelV>
+          </wp:anchor>
+        </w:drawing>
+      </w:r>
+      <w:r>
+        <w:drawing>
+          <wp:anchor distT="0" distB="0" distL="114300" distR="114300" simplePos="0" relativeHeight="251724800" behindDoc="0" locked="0" layoutInCell="1" allowOverlap="1" wp14:anchorId="7BC3DD02" wp14:editId="3DE38CE0">
+            <wp:simplePos x="0" y="0"/>
+            <wp:positionH relativeFrom="margin">
+              <wp:posOffset>4212063</wp:posOffset>
+            </wp:positionH>
+            <wp:positionV relativeFrom="paragraph">
+              <wp:posOffset>3482380</wp:posOffset>
+            </wp:positionV>
+            <wp:extent cx="2276272" cy="1390503"/>
+            <wp:effectExtent l="0" t="0" r="0" b="635"/>
+            <wp:wrapNone/>
+            <wp:docPr id="986305050" name="Picture 1"/>
+            <wp:cNvGraphicFramePr>
+              <a:graphicFrameLocks xmlns:a="http://schemas.openxmlformats.org/drawingml/2006/main" noChangeAspect="1"/>
+            </wp:cNvGraphicFramePr>
+            <a:graphic xmlns:a="http://schemas.openxmlformats.org/drawingml/2006/main">
+              <a:graphicData uri="http://schemas.openxmlformats.org/drawingml/2006/picture">
+                <pic:pic xmlns:pic="http://schemas.openxmlformats.org/drawingml/2006/picture">
+                  <pic:nvPicPr>
+                    <pic:cNvPr id="986305050" name=""/>
+                    <pic:cNvPicPr/>
+                  </pic:nvPicPr>
+                  <pic:blipFill>
+                    <a:blip r:embed="rId28"/>
+                    <a:stretch>
+                      <a:fillRect/>
+                    </a:stretch>
+                  </pic:blipFill>
+                  <pic:spPr>
+                    <a:xfrm>
+                      <a:off x="0" y="0"/>
+                      <a:ext cx="2276272" cy="1390503"/>
+                    </a:xfrm>
+                    <a:prstGeom prst="rect">
+                      <a:avLst/>
+                    </a:prstGeom>
+                  </pic:spPr>
+                </pic:pic>
+              </a:graphicData>
+            </a:graphic>
+            <wp14:sizeRelH relativeFrom="margin">
+              <wp14:pctWidth>0</wp14:pctWidth>
+            </wp14:sizeRelH>
+            <wp14:sizeRelV relativeFrom="margin">
+              <wp14:pctHeight>0</wp14:pctHeight>
+            </wp14:sizeRelV>
+          </wp:anchor>
+        </w:drawing>
+      </w:r>
+      <w:r>
+        <w:drawing>
+          <wp:anchor distT="0" distB="0" distL="114300" distR="114300" simplePos="0" relativeHeight="251725824" behindDoc="0" locked="0" layoutInCell="1" allowOverlap="1" wp14:anchorId="3CCC5FFD" wp14:editId="27D96CCF">
+            <wp:simplePos x="0" y="0"/>
+            <wp:positionH relativeFrom="margin">
+              <wp:posOffset>1873925</wp:posOffset>
+            </wp:positionH>
+            <wp:positionV relativeFrom="paragraph">
+              <wp:posOffset>3550204</wp:posOffset>
+            </wp:positionV>
+            <wp:extent cx="2210409" cy="1300048"/>
+            <wp:effectExtent l="0" t="0" r="0" b="0"/>
+            <wp:wrapNone/>
+            <wp:docPr id="1227672557" name="Picture 1"/>
+            <wp:cNvGraphicFramePr>
+              <a:graphicFrameLocks xmlns:a="http://schemas.openxmlformats.org/drawingml/2006/main" noChangeAspect="1"/>
+            </wp:cNvGraphicFramePr>
+            <a:graphic xmlns:a="http://schemas.openxmlformats.org/drawingml/2006/main">
+              <a:graphicData uri="http://schemas.openxmlformats.org/drawingml/2006/picture">
+                <pic:pic xmlns:pic="http://schemas.openxmlformats.org/drawingml/2006/picture">
+                  <pic:nvPicPr>
+                    <pic:cNvPr id="1227672557" name=""/>
+                    <pic:cNvPicPr/>
+                  </pic:nvPicPr>
+                  <pic:blipFill>
+                    <a:blip r:embed="rId29"/>
+                    <a:stretch>
+                      <a:fillRect/>
+                    </a:stretch>
+                  </pic:blipFill>
+                  <pic:spPr>
+                    <a:xfrm>
+                      <a:off x="0" y="0"/>
+                      <a:ext cx="2210409" cy="1300048"/>
+                    </a:xfrm>
+                    <a:prstGeom prst="rect">
+                      <a:avLst/>
+                    </a:prstGeom>
+                  </pic:spPr>
+                </pic:pic>
+              </a:graphicData>
+            </a:graphic>
+            <wp14:sizeRelH relativeFrom="margin">
+              <wp14:pctWidth>0</wp14:pctWidth>
+            </wp14:sizeRelH>
+            <wp14:sizeRelV relativeFrom="margin">
+              <wp14:pctHeight>0</wp14:pctHeight>
+            </wp14:sizeRelV>
+          </wp:anchor>
+        </w:drawing>
+      </w:r>
+      <w:r>
+        <w:drawing>
+          <wp:anchor distT="0" distB="0" distL="114300" distR="114300" simplePos="0" relativeHeight="251722752" behindDoc="0" locked="0" layoutInCell="1" allowOverlap="1" wp14:anchorId="539D508C" wp14:editId="12A32F5A">
+            <wp:simplePos x="0" y="0"/>
+            <wp:positionH relativeFrom="margin">
+              <wp:posOffset>1832083</wp:posOffset>
+            </wp:positionH>
+            <wp:positionV relativeFrom="paragraph">
+              <wp:posOffset>3387077</wp:posOffset>
+            </wp:positionV>
+            <wp:extent cx="216710" cy="119191"/>
+            <wp:effectExtent l="0" t="0" r="0" b="0"/>
+            <wp:wrapNone/>
+            <wp:docPr id="193858783" name="Picture 1"/>
+            <wp:cNvGraphicFramePr>
+              <a:graphicFrameLocks xmlns:a="http://schemas.openxmlformats.org/drawingml/2006/main" noChangeAspect="1"/>
+            </wp:cNvGraphicFramePr>
+            <a:graphic xmlns:a="http://schemas.openxmlformats.org/drawingml/2006/main">
+              <a:graphicData uri="http://schemas.openxmlformats.org/drawingml/2006/picture">
+                <pic:pic xmlns:pic="http://schemas.openxmlformats.org/drawingml/2006/picture">
+                  <pic:nvPicPr>
+                    <pic:cNvPr id="193858783" name=""/>
+                    <pic:cNvPicPr/>
+                  </pic:nvPicPr>
+                  <pic:blipFill>
+                    <a:blip r:embed="rId30"/>
+                    <a:stretch>
+                      <a:fillRect/>
+                    </a:stretch>
+                  </pic:blipFill>
+                  <pic:spPr>
+                    <a:xfrm>
+                      <a:off x="0" y="0"/>
+                      <a:ext cx="216710" cy="119191"/>
+                    </a:xfrm>
+                    <a:prstGeom prst="rect">
+                      <a:avLst/>
+                    </a:prstGeom>
+                  </pic:spPr>
+                </pic:pic>
+              </a:graphicData>
+            </a:graphic>
+            <wp14:sizeRelH relativeFrom="margin">
+              <wp14:pctWidth>0</wp14:pctWidth>
+            </wp14:sizeRelH>
+            <wp14:sizeRelV relativeFrom="margin">
+              <wp14:pctHeight>0</wp14:pctHeight>
+            </wp14:sizeRelV>
+          </wp:anchor>
+        </w:drawing>
+      </w:r>
+      <w:r>
+        <w:drawing>
+          <wp:anchor distT="0" distB="0" distL="114300" distR="114300" simplePos="0" relativeHeight="251686912" behindDoc="0" locked="0" layoutInCell="1" allowOverlap="1" wp14:anchorId="34E72A82" wp14:editId="428DEB70">
+            <wp:simplePos x="0" y="0"/>
+            <wp:positionH relativeFrom="column">
+              <wp:posOffset>1050587</wp:posOffset>
+            </wp:positionH>
+            <wp:positionV relativeFrom="paragraph">
+              <wp:posOffset>3628417</wp:posOffset>
+            </wp:positionV>
+            <wp:extent cx="417619" cy="145915"/>
+            <wp:effectExtent l="0" t="0" r="1905" b="6985"/>
+            <wp:wrapNone/>
+            <wp:docPr id="2070739416" name="Picture 1"/>
+            <wp:cNvGraphicFramePr>
+              <a:graphicFrameLocks xmlns:a="http://schemas.openxmlformats.org/drawingml/2006/main" noChangeAspect="1"/>
+            </wp:cNvGraphicFramePr>
+            <a:graphic xmlns:a="http://schemas.openxmlformats.org/drawingml/2006/main">
+              <a:graphicData uri="http://schemas.openxmlformats.org/drawingml/2006/picture">
+                <pic:pic xmlns:pic="http://schemas.openxmlformats.org/drawingml/2006/picture">
+                  <pic:nvPicPr>
+                    <pic:cNvPr id="2070739416" name=""/>
+                    <pic:cNvPicPr/>
+                  </pic:nvPicPr>
+                  <pic:blipFill>
+                    <a:blip r:embed="rId31"/>
+                    <a:stretch>
+                      <a:fillRect/>
+                    </a:stretch>
+                  </pic:blipFill>
+                  <pic:spPr>
+                    <a:xfrm>
+                      <a:off x="0" y="0"/>
+                      <a:ext cx="424483" cy="148313"/>
+                    </a:xfrm>
+                    <a:prstGeom prst="rect">
+                      <a:avLst/>
+                    </a:prstGeom>
+                  </pic:spPr>
+                </pic:pic>
+              </a:graphicData>
+            </a:graphic>
+            <wp14:sizeRelH relativeFrom="margin">
+              <wp14:pctWidth>0</wp14:pctWidth>
+            </wp14:sizeRelH>
+            <wp14:sizeRelV relativeFrom="margin">
+              <wp14:pctHeight>0</wp14:pctHeight>
+            </wp14:sizeRelV>
+          </wp:anchor>
+        </w:drawing>
+      </w:r>
+      <w:r>
+        <w:drawing>
+          <wp:anchor distT="0" distB="0" distL="114300" distR="114300" simplePos="0" relativeHeight="251711488" behindDoc="0" locked="0" layoutInCell="1" allowOverlap="1" wp14:anchorId="5FB9B3C2" wp14:editId="7FED172A">
+            <wp:simplePos x="0" y="0"/>
+            <wp:positionH relativeFrom="column">
+              <wp:posOffset>2709316</wp:posOffset>
+            </wp:positionH>
+            <wp:positionV relativeFrom="paragraph">
+              <wp:posOffset>2557145</wp:posOffset>
+            </wp:positionV>
+            <wp:extent cx="250377" cy="135843"/>
+            <wp:effectExtent l="0" t="0" r="0" b="0"/>
+            <wp:wrapNone/>
+            <wp:docPr id="559313488" name="Picture 1"/>
+            <wp:cNvGraphicFramePr>
+              <a:graphicFrameLocks xmlns:a="http://schemas.openxmlformats.org/drawingml/2006/main" noChangeAspect="1"/>
+            </wp:cNvGraphicFramePr>
+            <a:graphic xmlns:a="http://schemas.openxmlformats.org/drawingml/2006/main">
+              <a:graphicData uri="http://schemas.openxmlformats.org/drawingml/2006/picture">
+                <pic:pic xmlns:pic="http://schemas.openxmlformats.org/drawingml/2006/picture">
+                  <pic:nvPicPr>
+                    <pic:cNvPr id="559313488" name=""/>
+                    <pic:cNvPicPr/>
+                  </pic:nvPicPr>
+                  <pic:blipFill>
+                    <a:blip r:embed="rId32"/>
+                    <a:stretch>
+                      <a:fillRect/>
+                    </a:stretch>
+                  </pic:blipFill>
+                  <pic:spPr>
+                    <a:xfrm>
+                      <a:off x="0" y="0"/>
+                      <a:ext cx="250377" cy="135843"/>
+                    </a:xfrm>
+                    <a:prstGeom prst="rect">
+                      <a:avLst/>
+                    </a:prstGeom>
+                  </pic:spPr>
+                </pic:pic>
+              </a:graphicData>
+            </a:graphic>
+            <wp14:sizeRelH relativeFrom="margin">
+              <wp14:pctWidth>0</wp14:pctWidth>
+            </wp14:sizeRelH>
+            <wp14:sizeRelV relativeFrom="margin">
+              <wp14:pctHeight>0</wp14:pctHeight>
+            </wp14:sizeRelV>
+          </wp:anchor>
+        </w:drawing>
+      </w:r>
+      <w:r>
+        <w:drawing>
+          <wp:anchor distT="0" distB="0" distL="114300" distR="114300" simplePos="0" relativeHeight="251729920" behindDoc="0" locked="0" layoutInCell="1" allowOverlap="1" wp14:anchorId="654AD526" wp14:editId="1338D585">
+            <wp:simplePos x="0" y="0"/>
+            <wp:positionH relativeFrom="column">
+              <wp:posOffset>2976461</wp:posOffset>
+            </wp:positionH>
+            <wp:positionV relativeFrom="paragraph">
+              <wp:posOffset>2592434</wp:posOffset>
+            </wp:positionV>
+            <wp:extent cx="1723822" cy="943651"/>
+            <wp:effectExtent l="0" t="0" r="0" b="8890"/>
+            <wp:wrapNone/>
+            <wp:docPr id="259982363" name="Picture 1"/>
+            <wp:cNvGraphicFramePr>
+              <a:graphicFrameLocks xmlns:a="http://schemas.openxmlformats.org/drawingml/2006/main" noChangeAspect="1"/>
+            </wp:cNvGraphicFramePr>
+            <a:graphic xmlns:a="http://schemas.openxmlformats.org/drawingml/2006/main">
+              <a:graphicData uri="http://schemas.openxmlformats.org/drawingml/2006/picture">
+                <pic:pic xmlns:pic="http://schemas.openxmlformats.org/drawingml/2006/picture">
+                  <pic:nvPicPr>
+                    <pic:cNvPr id="259982363" name=""/>
+                    <pic:cNvPicPr/>
+                  </pic:nvPicPr>
+                  <pic:blipFill>
+                    <a:blip r:embed="rId33"/>
+                    <a:stretch>
+                      <a:fillRect/>
+                    </a:stretch>
+                  </pic:blipFill>
+                  <pic:spPr>
+                    <a:xfrm>
+                      <a:off x="0" y="0"/>
+                      <a:ext cx="1723822" cy="943651"/>
+                    </a:xfrm>
+                    <a:prstGeom prst="rect">
+                      <a:avLst/>
+                    </a:prstGeom>
+                  </pic:spPr>
+                </pic:pic>
+              </a:graphicData>
+            </a:graphic>
+            <wp14:sizeRelH relativeFrom="margin">
+              <wp14:pctWidth>0</wp14:pctWidth>
+            </wp14:sizeRelH>
+            <wp14:sizeRelV relativeFrom="margin">
+              <wp14:pctHeight>0</wp14:pctHeight>
+            </wp14:sizeRelV>
+          </wp:anchor>
+        </w:drawing>
+      </w:r>
+      <w:r>
+        <w:drawing>
+          <wp:anchor distT="0" distB="0" distL="114300" distR="114300" simplePos="0" relativeHeight="251705344" behindDoc="0" locked="0" layoutInCell="1" allowOverlap="1" wp14:anchorId="60CFDA98" wp14:editId="41946A97">
+            <wp:simplePos x="0" y="0"/>
+            <wp:positionH relativeFrom="margin">
+              <wp:posOffset>3239081</wp:posOffset>
+            </wp:positionH>
+            <wp:positionV relativeFrom="paragraph">
+              <wp:posOffset>1497965</wp:posOffset>
+            </wp:positionV>
+            <wp:extent cx="1895872" cy="1079770"/>
+            <wp:effectExtent l="0" t="0" r="0" b="6350"/>
+            <wp:wrapNone/>
+            <wp:docPr id="1179254132" name="Picture 1"/>
+            <wp:cNvGraphicFramePr>
+              <a:graphicFrameLocks xmlns:a="http://schemas.openxmlformats.org/drawingml/2006/main" noChangeAspect="1"/>
+            </wp:cNvGraphicFramePr>
+            <a:graphic xmlns:a="http://schemas.openxmlformats.org/drawingml/2006/main">
+              <a:graphicData uri="http://schemas.openxmlformats.org/drawingml/2006/picture">
+                <pic:pic xmlns:pic="http://schemas.openxmlformats.org/drawingml/2006/picture">
+                  <pic:nvPicPr>
+                    <pic:cNvPr id="1179254132" name=""/>
+                    <pic:cNvPicPr/>
+                  </pic:nvPicPr>
+                  <pic:blipFill>
+                    <a:blip r:embed="rId34"/>
+                    <a:stretch>
+                      <a:fillRect/>
+                    </a:stretch>
+                  </pic:blipFill>
+                  <pic:spPr>
+                    <a:xfrm>
+                      <a:off x="0" y="0"/>
+                      <a:ext cx="1895872" cy="1079770"/>
+                    </a:xfrm>
+                    <a:prstGeom prst="rect">
+                      <a:avLst/>
+                    </a:prstGeom>
+                  </pic:spPr>
+                </pic:pic>
+              </a:graphicData>
+            </a:graphic>
+            <wp14:sizeRelH relativeFrom="margin">
+              <wp14:pctWidth>0</wp14:pctWidth>
+            </wp14:sizeRelH>
+            <wp14:sizeRelV relativeFrom="margin">
+              <wp14:pctHeight>0</wp14:pctHeight>
+            </wp14:sizeRelV>
+          </wp:anchor>
+        </w:drawing>
+      </w:r>
+      <w:r>
+        <w:drawing>
+          <wp:anchor distT="0" distB="0" distL="114300" distR="114300" simplePos="0" relativeHeight="251697152" behindDoc="0" locked="0" layoutInCell="1" allowOverlap="1" wp14:anchorId="5C16108C" wp14:editId="37A96EEB">
+            <wp:simplePos x="0" y="0"/>
+            <wp:positionH relativeFrom="margin">
+              <wp:posOffset>1400784</wp:posOffset>
+            </wp:positionH>
+            <wp:positionV relativeFrom="paragraph">
+              <wp:posOffset>2130358</wp:posOffset>
+            </wp:positionV>
+            <wp:extent cx="1770434" cy="1058326"/>
+            <wp:effectExtent l="0" t="0" r="1270" b="8890"/>
+            <wp:wrapNone/>
+            <wp:docPr id="575581883" name="Picture 1"/>
+            <wp:cNvGraphicFramePr>
+              <a:graphicFrameLocks xmlns:a="http://schemas.openxmlformats.org/drawingml/2006/main" noChangeAspect="1"/>
+            </wp:cNvGraphicFramePr>
+            <a:graphic xmlns:a="http://schemas.openxmlformats.org/drawingml/2006/main">
+              <a:graphicData uri="http://schemas.openxmlformats.org/drawingml/2006/picture">
+                <pic:pic xmlns:pic="http://schemas.openxmlformats.org/drawingml/2006/picture">
+                  <pic:nvPicPr>
+                    <pic:cNvPr id="575581883" name=""/>
+                    <pic:cNvPicPr/>
+                  </pic:nvPicPr>
+                  <pic:blipFill>
+                    <a:blip r:embed="rId35"/>
+                    <a:stretch>
+                      <a:fillRect/>
+                    </a:stretch>
+                  </pic:blipFill>
+                  <pic:spPr>
+                    <a:xfrm>
+                      <a:off x="0" y="0"/>
+                      <a:ext cx="1787181" cy="1068337"/>
+                    </a:xfrm>
+                    <a:prstGeom prst="rect">
+                      <a:avLst/>
+                    </a:prstGeom>
+                  </pic:spPr>
+                </pic:pic>
+              </a:graphicData>
+            </a:graphic>
+            <wp14:sizeRelH relativeFrom="margin">
+              <wp14:pctWidth>0</wp14:pctWidth>
+            </wp14:sizeRelH>
+            <wp14:sizeRelV relativeFrom="margin">
+              <wp14:pctHeight>0</wp14:pctHeight>
+            </wp14:sizeRelV>
+          </wp:anchor>
+        </w:drawing>
+      </w:r>
+      <w:r>
+        <w:drawing>
+          <wp:anchor distT="0" distB="0" distL="114300" distR="114300" simplePos="0" relativeHeight="251707392" behindDoc="0" locked="0" layoutInCell="1" allowOverlap="1" wp14:anchorId="01B964A1" wp14:editId="7BFB3D9B">
+            <wp:simplePos x="0" y="0"/>
+            <wp:positionH relativeFrom="margin">
+              <wp:align>center</wp:align>
+            </wp:positionH>
+            <wp:positionV relativeFrom="paragraph">
+              <wp:posOffset>1551724</wp:posOffset>
+            </wp:positionV>
+            <wp:extent cx="183610" cy="111073"/>
+            <wp:effectExtent l="0" t="0" r="6985" b="3810"/>
+            <wp:wrapNone/>
+            <wp:docPr id="1589805215" name="Picture 1"/>
+            <wp:cNvGraphicFramePr>
+              <a:graphicFrameLocks xmlns:a="http://schemas.openxmlformats.org/drawingml/2006/main" noChangeAspect="1"/>
+            </wp:cNvGraphicFramePr>
+            <a:graphic xmlns:a="http://schemas.openxmlformats.org/drawingml/2006/main">
+              <a:graphicData uri="http://schemas.openxmlformats.org/drawingml/2006/picture">
+                <pic:pic xmlns:pic="http://schemas.openxmlformats.org/drawingml/2006/picture">
+                  <pic:nvPicPr>
+                    <pic:cNvPr id="1589805215" name=""/>
+                    <pic:cNvPicPr/>
+                  </pic:nvPicPr>
+                  <pic:blipFill>
+                    <a:blip r:embed="rId36"/>
+                    <a:stretch>
+                      <a:fillRect/>
+                    </a:stretch>
+                  </pic:blipFill>
+                  <pic:spPr>
+                    <a:xfrm>
+                      <a:off x="0" y="0"/>
+                      <a:ext cx="183610" cy="111073"/>
+                    </a:xfrm>
+                    <a:prstGeom prst="rect">
+                      <a:avLst/>
+                    </a:prstGeom>
+                  </pic:spPr>
+                </pic:pic>
+              </a:graphicData>
+            </a:graphic>
+            <wp14:sizeRelH relativeFrom="margin">
+              <wp14:pctWidth>0</wp14:pctWidth>
+            </wp14:sizeRelH>
+            <wp14:sizeRelV relativeFrom="margin">
+              <wp14:pctHeight>0</wp14:pctHeight>
+            </wp14:sizeRelV>
+          </wp:anchor>
+        </w:drawing>
+      </w:r>
+      <w:r>
+        <w:drawing>
+          <wp:anchor distT="0" distB="0" distL="114300" distR="114300" simplePos="0" relativeHeight="251703296" behindDoc="0" locked="0" layoutInCell="1" allowOverlap="1" wp14:anchorId="53A481C8" wp14:editId="6717F174">
+            <wp:simplePos x="0" y="0"/>
+            <wp:positionH relativeFrom="column">
+              <wp:posOffset>3421384</wp:posOffset>
+            </wp:positionH>
+            <wp:positionV relativeFrom="paragraph">
+              <wp:posOffset>495787</wp:posOffset>
+            </wp:positionV>
+            <wp:extent cx="242440" cy="126730"/>
+            <wp:effectExtent l="0" t="0" r="5715" b="6985"/>
+            <wp:wrapNone/>
+            <wp:docPr id="2074704338" name="Picture 1"/>
+            <wp:cNvGraphicFramePr>
+              <a:graphicFrameLocks xmlns:a="http://schemas.openxmlformats.org/drawingml/2006/main" noChangeAspect="1"/>
+            </wp:cNvGraphicFramePr>
+            <a:graphic xmlns:a="http://schemas.openxmlformats.org/drawingml/2006/main">
+              <a:graphicData uri="http://schemas.openxmlformats.org/drawingml/2006/picture">
+                <pic:pic xmlns:pic="http://schemas.openxmlformats.org/drawingml/2006/picture">
+                  <pic:nvPicPr>
+                    <pic:cNvPr id="2074704338" name=""/>
+                    <pic:cNvPicPr/>
+                  </pic:nvPicPr>
+                  <pic:blipFill>
+                    <a:blip r:embed="rId37"/>
+                    <a:stretch>
+                      <a:fillRect/>
+                    </a:stretch>
+                  </pic:blipFill>
+                  <pic:spPr>
+                    <a:xfrm>
+                      <a:off x="0" y="0"/>
+                      <a:ext cx="242440" cy="126730"/>
+                    </a:xfrm>
+                    <a:prstGeom prst="rect">
+                      <a:avLst/>
+                    </a:prstGeom>
+                  </pic:spPr>
+                </pic:pic>
+              </a:graphicData>
+            </a:graphic>
+            <wp14:sizeRelH relativeFrom="margin">
+              <wp14:pctWidth>0</wp14:pctWidth>
+            </wp14:sizeRelH>
+            <wp14:sizeRelV relativeFrom="margin">
+              <wp14:pctHeight>0</wp14:pctHeight>
+            </wp14:sizeRelV>
+          </wp:anchor>
+        </w:drawing>
+      </w:r>
+      <w:r>
+        <w:drawing>
+          <wp:anchor distT="0" distB="0" distL="114300" distR="114300" simplePos="0" relativeHeight="251701248" behindDoc="0" locked="0" layoutInCell="1" allowOverlap="1" wp14:anchorId="3D277E18" wp14:editId="0F581183">
+            <wp:simplePos x="0" y="0"/>
+            <wp:positionH relativeFrom="column">
+              <wp:posOffset>3297677</wp:posOffset>
+            </wp:positionH>
+            <wp:positionV relativeFrom="paragraph">
+              <wp:posOffset>515565</wp:posOffset>
+            </wp:positionV>
+            <wp:extent cx="1870596" cy="953311"/>
+            <wp:effectExtent l="0" t="0" r="0" b="0"/>
+            <wp:wrapNone/>
+            <wp:docPr id="906963704" name="Picture 1"/>
+            <wp:cNvGraphicFramePr>
+              <a:graphicFrameLocks xmlns:a="http://schemas.openxmlformats.org/drawingml/2006/main" noChangeAspect="1"/>
+            </wp:cNvGraphicFramePr>
+            <a:graphic xmlns:a="http://schemas.openxmlformats.org/drawingml/2006/main">
+              <a:graphicData uri="http://schemas.openxmlformats.org/drawingml/2006/picture">
+                <pic:pic xmlns:pic="http://schemas.openxmlformats.org/drawingml/2006/picture">
+                  <pic:nvPicPr>
+                    <pic:cNvPr id="906963704" name=""/>
+                    <pic:cNvPicPr/>
+                  </pic:nvPicPr>
+                  <pic:blipFill>
+                    <a:blip r:embed="rId38"/>
+                    <a:stretch>
+                      <a:fillRect/>
+                    </a:stretch>
+                  </pic:blipFill>
+                  <pic:spPr>
+                    <a:xfrm>
+                      <a:off x="0" y="0"/>
+                      <a:ext cx="1873239" cy="954658"/>
+                    </a:xfrm>
+                    <a:prstGeom prst="rect">
+                      <a:avLst/>
+                    </a:prstGeom>
+                  </pic:spPr>
+                </pic:pic>
+              </a:graphicData>
+            </a:graphic>
+            <wp14:sizeRelH relativeFrom="margin">
+              <wp14:pctWidth>0</wp14:pctWidth>
+            </wp14:sizeRelH>
+            <wp14:sizeRelV relativeFrom="margin">
+              <wp14:pctHeight>0</wp14:pctHeight>
+            </wp14:sizeRelV>
+          </wp:anchor>
+        </w:drawing>
+      </w:r>
+      <w:r>
+        <w:drawing>
+          <wp:anchor distT="0" distB="0" distL="114300" distR="114300" simplePos="0" relativeHeight="251699200" behindDoc="0" locked="0" layoutInCell="1" allowOverlap="1" wp14:anchorId="7552D43F" wp14:editId="5C593C08">
+            <wp:simplePos x="0" y="0"/>
+            <wp:positionH relativeFrom="column">
+              <wp:posOffset>1383165</wp:posOffset>
+            </wp:positionH>
+            <wp:positionV relativeFrom="paragraph">
+              <wp:posOffset>2256128</wp:posOffset>
+            </wp:positionV>
+            <wp:extent cx="216199" cy="117002"/>
+            <wp:effectExtent l="0" t="0" r="0" b="0"/>
+            <wp:wrapNone/>
+            <wp:docPr id="1158352719" name="Picture 1"/>
+            <wp:cNvGraphicFramePr>
+              <a:graphicFrameLocks xmlns:a="http://schemas.openxmlformats.org/drawingml/2006/main" noChangeAspect="1"/>
+            </wp:cNvGraphicFramePr>
+            <a:graphic xmlns:a="http://schemas.openxmlformats.org/drawingml/2006/main">
+              <a:graphicData uri="http://schemas.openxmlformats.org/drawingml/2006/picture">
+                <pic:pic xmlns:pic="http://schemas.openxmlformats.org/drawingml/2006/picture">
+                  <pic:nvPicPr>
+                    <pic:cNvPr id="1158352719" name=""/>
+                    <pic:cNvPicPr/>
+                  </pic:nvPicPr>
+                  <pic:blipFill>
+                    <a:blip r:embed="rId39"/>
+                    <a:stretch>
+                      <a:fillRect/>
+                    </a:stretch>
+                  </pic:blipFill>
+                  <pic:spPr>
+                    <a:xfrm>
+                      <a:off x="0" y="0"/>
+                      <a:ext cx="216199" cy="117002"/>
+                    </a:xfrm>
+                    <a:prstGeom prst="rect">
+                      <a:avLst/>
+                    </a:prstGeom>
+                  </pic:spPr>
+                </pic:pic>
+              </a:graphicData>
+            </a:graphic>
+            <wp14:sizeRelH relativeFrom="margin">
+              <wp14:pctWidth>0</wp14:pctWidth>
+            </wp14:sizeRelH>
+            <wp14:sizeRelV relativeFrom="margin">
+              <wp14:pctHeight>0</wp14:pctHeight>
+            </wp14:sizeRelV>
+          </wp:anchor>
+        </w:drawing>
+      </w:r>
+      <w:r>
+        <w:drawing>
+          <wp:anchor distT="0" distB="0" distL="114300" distR="114300" simplePos="0" relativeHeight="251695104" behindDoc="0" locked="0" layoutInCell="1" allowOverlap="1" wp14:anchorId="1FA029B9" wp14:editId="4909C549">
+            <wp:simplePos x="0" y="0"/>
+            <wp:positionH relativeFrom="column">
+              <wp:posOffset>1443462</wp:posOffset>
+            </wp:positionH>
+            <wp:positionV relativeFrom="paragraph">
+              <wp:posOffset>1196502</wp:posOffset>
+            </wp:positionV>
+            <wp:extent cx="253473" cy="141138"/>
+            <wp:effectExtent l="0" t="0" r="0" b="0"/>
+            <wp:wrapNone/>
+            <wp:docPr id="412864153" name="Picture 1"/>
+            <wp:cNvGraphicFramePr>
+              <a:graphicFrameLocks xmlns:a="http://schemas.openxmlformats.org/drawingml/2006/main" noChangeAspect="1"/>
+            </wp:cNvGraphicFramePr>
+            <a:graphic xmlns:a="http://schemas.openxmlformats.org/drawingml/2006/main">
+              <a:graphicData uri="http://schemas.openxmlformats.org/drawingml/2006/picture">
+                <pic:pic xmlns:pic="http://schemas.openxmlformats.org/drawingml/2006/picture">
+                  <pic:nvPicPr>
+                    <pic:cNvPr id="412864153" name=""/>
+                    <pic:cNvPicPr/>
+                  </pic:nvPicPr>
+                  <pic:blipFill>
+                    <a:blip r:embed="rId40"/>
+                    <a:stretch>
+                      <a:fillRect/>
+                    </a:stretch>
+                  </pic:blipFill>
+                  <pic:spPr>
+                    <a:xfrm>
+                      <a:off x="0" y="0"/>
+                      <a:ext cx="262981" cy="146432"/>
+                    </a:xfrm>
+                    <a:prstGeom prst="rect">
+                      <a:avLst/>
+                    </a:prstGeom>
+                  </pic:spPr>
+                </pic:pic>
+              </a:graphicData>
+            </a:graphic>
+            <wp14:sizeRelH relativeFrom="margin">
+              <wp14:pctWidth>0</wp14:pctWidth>
+            </wp14:sizeRelH>
+            <wp14:sizeRelV relativeFrom="margin">
+              <wp14:pctHeight>0</wp14:pctHeight>
+            </wp14:sizeRelV>
+          </wp:anchor>
+        </w:drawing>
+      </w:r>
+      <w:r>
+        <w:drawing>
+          <wp:anchor distT="0" distB="0" distL="114300" distR="114300" simplePos="0" relativeHeight="251693056" behindDoc="0" locked="0" layoutInCell="1" allowOverlap="1" wp14:anchorId="70998512" wp14:editId="33E975F4">
+            <wp:simplePos x="0" y="0"/>
+            <wp:positionH relativeFrom="column">
+              <wp:posOffset>1703205</wp:posOffset>
+            </wp:positionH>
+            <wp:positionV relativeFrom="paragraph">
+              <wp:posOffset>1170576</wp:posOffset>
+            </wp:positionV>
+            <wp:extent cx="1575881" cy="982007"/>
+            <wp:effectExtent l="0" t="0" r="5715" b="8890"/>
+            <wp:wrapNone/>
+            <wp:docPr id="2082349981" name="Picture 1"/>
+            <wp:cNvGraphicFramePr>
+              <a:graphicFrameLocks xmlns:a="http://schemas.openxmlformats.org/drawingml/2006/main" noChangeAspect="1"/>
+            </wp:cNvGraphicFramePr>
+            <a:graphic xmlns:a="http://schemas.openxmlformats.org/drawingml/2006/main">
+              <a:graphicData uri="http://schemas.openxmlformats.org/drawingml/2006/picture">
+                <pic:pic xmlns:pic="http://schemas.openxmlformats.org/drawingml/2006/picture">
+                  <pic:nvPicPr>
+                    <pic:cNvPr id="2082349981" name=""/>
+                    <pic:cNvPicPr/>
+                  </pic:nvPicPr>
+                  <pic:blipFill>
+                    <a:blip r:embed="rId41"/>
+                    <a:stretch>
+                      <a:fillRect/>
+                    </a:stretch>
+                  </pic:blipFill>
+                  <pic:spPr>
+                    <a:xfrm>
+                      <a:off x="0" y="0"/>
+                      <a:ext cx="1575881" cy="982007"/>
+                    </a:xfrm>
+                    <a:prstGeom prst="rect">
+                      <a:avLst/>
+                    </a:prstGeom>
+                  </pic:spPr>
+                </pic:pic>
+              </a:graphicData>
+            </a:graphic>
+            <wp14:sizeRelH relativeFrom="margin">
+              <wp14:pctWidth>0</wp14:pctWidth>
+            </wp14:sizeRelH>
+            <wp14:sizeRelV relativeFrom="margin">
+              <wp14:pctHeight>0</wp14:pctHeight>
+            </wp14:sizeRelV>
+          </wp:anchor>
+        </w:drawing>
+      </w:r>
+      <w:r>
+        <w:drawing>
+          <wp:anchor distT="0" distB="0" distL="114300" distR="114300" simplePos="0" relativeHeight="251691008" behindDoc="0" locked="0" layoutInCell="1" allowOverlap="1" wp14:anchorId="284E09ED" wp14:editId="351CF782">
+            <wp:simplePos x="0" y="0"/>
+            <wp:positionH relativeFrom="column">
+              <wp:posOffset>1256678</wp:posOffset>
+            </wp:positionH>
+            <wp:positionV relativeFrom="paragraph">
+              <wp:posOffset>398375</wp:posOffset>
+            </wp:positionV>
+            <wp:extent cx="189149" cy="129702"/>
+            <wp:effectExtent l="0" t="0" r="1905" b="3810"/>
+            <wp:wrapNone/>
+            <wp:docPr id="1966738199" name="Picture 1"/>
+            <wp:cNvGraphicFramePr>
+              <a:graphicFrameLocks xmlns:a="http://schemas.openxmlformats.org/drawingml/2006/main" noChangeAspect="1"/>
+            </wp:cNvGraphicFramePr>
+            <a:graphic xmlns:a="http://schemas.openxmlformats.org/drawingml/2006/main">
+              <a:graphicData uri="http://schemas.openxmlformats.org/drawingml/2006/picture">
+                <pic:pic xmlns:pic="http://schemas.openxmlformats.org/drawingml/2006/picture">
+                  <pic:nvPicPr>
+                    <pic:cNvPr id="1966738199" name=""/>
+                    <pic:cNvPicPr/>
+                  </pic:nvPicPr>
+                  <pic:blipFill>
+                    <a:blip r:embed="rId42"/>
+                    <a:stretch>
+                      <a:fillRect/>
+                    </a:stretch>
+                  </pic:blipFill>
+                  <pic:spPr>
+                    <a:xfrm>
+                      <a:off x="0" y="0"/>
+                      <a:ext cx="189149" cy="129702"/>
+                    </a:xfrm>
+                    <a:prstGeom prst="rect">
+                      <a:avLst/>
+                    </a:prstGeom>
+                  </pic:spPr>
+                </pic:pic>
+              </a:graphicData>
+            </a:graphic>
+            <wp14:sizeRelH relativeFrom="margin">
+              <wp14:pctWidth>0</wp14:pctWidth>
+            </wp14:sizeRelH>
+            <wp14:sizeRelV relativeFrom="margin">
+              <wp14:pctHeight>0</wp14:pctHeight>
+            </wp14:sizeRelV>
+          </wp:anchor>
+        </w:drawing>
+      </w:r>
+      <w:r>
+        <w:drawing>
+          <wp:anchor distT="0" distB="0" distL="114300" distR="114300" simplePos="0" relativeHeight="251688960" behindDoc="0" locked="0" layoutInCell="1" allowOverlap="1" wp14:anchorId="02D90B85" wp14:editId="758083B8">
+            <wp:simplePos x="0" y="0"/>
+            <wp:positionH relativeFrom="column">
+              <wp:posOffset>1244937</wp:posOffset>
+            </wp:positionH>
+            <wp:positionV relativeFrom="paragraph">
+              <wp:posOffset>233045</wp:posOffset>
+            </wp:positionV>
+            <wp:extent cx="1695082" cy="904672"/>
+            <wp:effectExtent l="0" t="0" r="635" b="0"/>
+            <wp:wrapNone/>
+            <wp:docPr id="55521942" name="Picture 1"/>
+            <wp:cNvGraphicFramePr>
+              <a:graphicFrameLocks xmlns:a="http://schemas.openxmlformats.org/drawingml/2006/main" noChangeAspect="1"/>
+            </wp:cNvGraphicFramePr>
+            <a:graphic xmlns:a="http://schemas.openxmlformats.org/drawingml/2006/main">
+              <a:graphicData uri="http://schemas.openxmlformats.org/drawingml/2006/picture">
+                <pic:pic xmlns:pic="http://schemas.openxmlformats.org/drawingml/2006/picture">
+                  <pic:nvPicPr>
+                    <pic:cNvPr id="55521942" name=""/>
+                    <pic:cNvPicPr/>
+                  </pic:nvPicPr>
+                  <pic:blipFill>
+                    <a:blip r:embed="rId43"/>
+                    <a:stretch>
+                      <a:fillRect/>
+                    </a:stretch>
+                  </pic:blipFill>
+                  <pic:spPr>
+                    <a:xfrm>
+                      <a:off x="0" y="0"/>
+                      <a:ext cx="1695082" cy="904672"/>
+                    </a:xfrm>
+                    <a:prstGeom prst="rect">
+                      <a:avLst/>
+                    </a:prstGeom>
+                  </pic:spPr>
+                </pic:pic>
+              </a:graphicData>
+            </a:graphic>
+            <wp14:sizeRelH relativeFrom="margin">
+              <wp14:pctWidth>0</wp14:pctWidth>
+            </wp14:sizeRelH>
+            <wp14:sizeRelV relativeFrom="margin">
+              <wp14:pctHeight>0</wp14:pctHeight>
+            </wp14:sizeRelV>
+          </wp:anchor>
+        </w:drawing>
+      </w:r>
+      <w:r>
+        <w:drawing>
+          <wp:anchor distT="0" distB="0" distL="114300" distR="114300" simplePos="0" relativeHeight="251684864" behindDoc="0" locked="0" layoutInCell="1" allowOverlap="1" wp14:anchorId="02BBA16F" wp14:editId="0CE6BAC3">
+            <wp:simplePos x="0" y="0"/>
+            <wp:positionH relativeFrom="column">
+              <wp:posOffset>-353060</wp:posOffset>
+            </wp:positionH>
+            <wp:positionV relativeFrom="paragraph">
+              <wp:posOffset>3355313</wp:posOffset>
+            </wp:positionV>
+            <wp:extent cx="2053912" cy="1139541"/>
+            <wp:effectExtent l="0" t="0" r="3810" b="3810"/>
+            <wp:wrapNone/>
+            <wp:docPr id="1109722967" name="Picture 1"/>
+            <wp:cNvGraphicFramePr>
+              <a:graphicFrameLocks xmlns:a="http://schemas.openxmlformats.org/drawingml/2006/main" noChangeAspect="1"/>
+            </wp:cNvGraphicFramePr>
+            <a:graphic xmlns:a="http://schemas.openxmlformats.org/drawingml/2006/main">
+              <a:graphicData uri="http://schemas.openxmlformats.org/drawingml/2006/picture">
+                <pic:pic xmlns:pic="http://schemas.openxmlformats.org/drawingml/2006/picture">
+                  <pic:nvPicPr>
+                    <pic:cNvPr id="1109722967" name=""/>
+                    <pic:cNvPicPr/>
+                  </pic:nvPicPr>
+                  <pic:blipFill>
+                    <a:blip r:embed="rId44"/>
+                    <a:stretch>
+                      <a:fillRect/>
+                    </a:stretch>
+                  </pic:blipFill>
+                  <pic:spPr>
+                    <a:xfrm>
+                      <a:off x="0" y="0"/>
+                      <a:ext cx="2053912" cy="1139541"/>
+                    </a:xfrm>
+                    <a:prstGeom prst="rect">
+                      <a:avLst/>
+                    </a:prstGeom>
+                  </pic:spPr>
+                </pic:pic>
+              </a:graphicData>
+            </a:graphic>
+            <wp14:sizeRelH relativeFrom="margin">
+              <wp14:pctWidth>0</wp14:pctWidth>
+            </wp14:sizeRelH>
+            <wp14:sizeRelV relativeFrom="margin">
+              <wp14:pctHeight>0</wp14:pctHeight>
+            </wp14:sizeRelV>
+          </wp:anchor>
+        </w:drawing>
+      </w:r>
+      <w:r>
+        <w:drawing>
+          <wp:anchor distT="0" distB="0" distL="114300" distR="114300" simplePos="0" relativeHeight="251682816" behindDoc="0" locked="0" layoutInCell="1" allowOverlap="1" wp14:anchorId="768E6F41" wp14:editId="48D6615B">
+            <wp:simplePos x="0" y="0"/>
+            <wp:positionH relativeFrom="column">
+              <wp:posOffset>125865</wp:posOffset>
+            </wp:positionH>
+            <wp:positionV relativeFrom="paragraph">
+              <wp:posOffset>2947170</wp:posOffset>
+            </wp:positionV>
+            <wp:extent cx="280761" cy="175098"/>
+            <wp:effectExtent l="0" t="0" r="5080" b="0"/>
+            <wp:wrapNone/>
+            <wp:docPr id="1851498891" name="Picture 1"/>
+            <wp:cNvGraphicFramePr>
+              <a:graphicFrameLocks xmlns:a="http://schemas.openxmlformats.org/drawingml/2006/main" noChangeAspect="1"/>
+            </wp:cNvGraphicFramePr>
+            <a:graphic xmlns:a="http://schemas.openxmlformats.org/drawingml/2006/main">
+              <a:graphicData uri="http://schemas.openxmlformats.org/drawingml/2006/picture">
+                <pic:pic xmlns:pic="http://schemas.openxmlformats.org/drawingml/2006/picture">
+                  <pic:nvPicPr>
+                    <pic:cNvPr id="1851498891" name=""/>
+                    <pic:cNvPicPr/>
+                  </pic:nvPicPr>
+                  <pic:blipFill>
+                    <a:blip r:embed="rId45"/>
+                    <a:stretch>
+                      <a:fillRect/>
+                    </a:stretch>
+                  </pic:blipFill>
+                  <pic:spPr>
+                    <a:xfrm>
+                      <a:off x="0" y="0"/>
+                      <a:ext cx="280761" cy="175098"/>
+                    </a:xfrm>
+                    <a:prstGeom prst="rect">
+                      <a:avLst/>
+                    </a:prstGeom>
+                  </pic:spPr>
+                </pic:pic>
+              </a:graphicData>
+            </a:graphic>
+            <wp14:sizeRelH relativeFrom="margin">
+              <wp14:pctWidth>0</wp14:pctWidth>
+            </wp14:sizeRelH>
+            <wp14:sizeRelV relativeFrom="margin">
+              <wp14:pctHeight>0</wp14:pctHeight>
+            </wp14:sizeRelV>
+          </wp:anchor>
+        </w:drawing>
+      </w:r>
+      <w:r>
+        <w:drawing>
+          <wp:anchor distT="0" distB="0" distL="114300" distR="114300" simplePos="0" relativeHeight="251680768" behindDoc="0" locked="0" layoutInCell="1" allowOverlap="1" wp14:anchorId="7D39216F" wp14:editId="7E7961D6">
+            <wp:simplePos x="0" y="0"/>
+            <wp:positionH relativeFrom="column">
+              <wp:posOffset>-350115</wp:posOffset>
+            </wp:positionH>
+            <wp:positionV relativeFrom="paragraph">
+              <wp:posOffset>2976245</wp:posOffset>
+            </wp:positionV>
+            <wp:extent cx="1753067" cy="408562"/>
+            <wp:effectExtent l="0" t="0" r="0" b="0"/>
+            <wp:wrapNone/>
+            <wp:docPr id="1811118763" name="Picture 1"/>
+            <wp:cNvGraphicFramePr>
+              <a:graphicFrameLocks xmlns:a="http://schemas.openxmlformats.org/drawingml/2006/main" noChangeAspect="1"/>
+            </wp:cNvGraphicFramePr>
+            <a:graphic xmlns:a="http://schemas.openxmlformats.org/drawingml/2006/main">
+              <a:graphicData uri="http://schemas.openxmlformats.org/drawingml/2006/picture">
+                <pic:pic xmlns:pic="http://schemas.openxmlformats.org/drawingml/2006/picture">
+                  <pic:nvPicPr>
+                    <pic:cNvPr id="1811118763" name=""/>
+                    <pic:cNvPicPr/>
+                  </pic:nvPicPr>
+                  <pic:blipFill>
+                    <a:blip r:embed="rId46"/>
+                    <a:stretch>
+                      <a:fillRect/>
+                    </a:stretch>
+                  </pic:blipFill>
+                  <pic:spPr>
+                    <a:xfrm>
+                      <a:off x="0" y="0"/>
+                      <a:ext cx="1753067" cy="408562"/>
+                    </a:xfrm>
+                    <a:prstGeom prst="rect">
+                      <a:avLst/>
+                    </a:prstGeom>
+                  </pic:spPr>
+                </pic:pic>
+              </a:graphicData>
+            </a:graphic>
+            <wp14:sizeRelH relativeFrom="margin">
+              <wp14:pctWidth>0</wp14:pctWidth>
+            </wp14:sizeRelH>
+            <wp14:sizeRelV relativeFrom="margin">
+              <wp14:pctHeight>0</wp14:pctHeight>
+            </wp14:sizeRelV>
+          </wp:anchor>
+        </w:drawing>
+      </w:r>
+      <w:r>
+        <w:drawing>
+          <wp:anchor distT="0" distB="0" distL="114300" distR="114300" simplePos="0" relativeHeight="251678720" behindDoc="0" locked="0" layoutInCell="1" allowOverlap="1" wp14:anchorId="66F19308" wp14:editId="773DD8A8">
+            <wp:simplePos x="0" y="0"/>
+            <wp:positionH relativeFrom="leftMargin">
+              <wp:align>right</wp:align>
+            </wp:positionH>
+            <wp:positionV relativeFrom="paragraph">
+              <wp:posOffset>2227499</wp:posOffset>
+            </wp:positionV>
+            <wp:extent cx="283629" cy="167938"/>
+            <wp:effectExtent l="0" t="0" r="2540" b="3810"/>
+            <wp:wrapNone/>
+            <wp:docPr id="1674036782" name="Picture 1"/>
+            <wp:cNvGraphicFramePr>
+              <a:graphicFrameLocks xmlns:a="http://schemas.openxmlformats.org/drawingml/2006/main" noChangeAspect="1"/>
+            </wp:cNvGraphicFramePr>
+            <a:graphic xmlns:a="http://schemas.openxmlformats.org/drawingml/2006/main">
+              <a:graphicData uri="http://schemas.openxmlformats.org/drawingml/2006/picture">
+                <pic:pic xmlns:pic="http://schemas.openxmlformats.org/drawingml/2006/picture">
+                  <pic:nvPicPr>
+                    <pic:cNvPr id="1674036782" name=""/>
+                    <pic:cNvPicPr/>
+                  </pic:nvPicPr>
+                  <pic:blipFill>
+                    <a:blip r:embed="rId47"/>
+                    <a:stretch>
+                      <a:fillRect/>
+                    </a:stretch>
+                  </pic:blipFill>
+                  <pic:spPr>
+                    <a:xfrm>
+                      <a:off x="0" y="0"/>
+                      <a:ext cx="283629" cy="167938"/>
+                    </a:xfrm>
+                    <a:prstGeom prst="rect">
+                      <a:avLst/>
+                    </a:prstGeom>
+                  </pic:spPr>
+                </pic:pic>
+              </a:graphicData>
+            </a:graphic>
+            <wp14:sizeRelH relativeFrom="margin">
+              <wp14:pctWidth>0</wp14:pctWidth>
+            </wp14:sizeRelH>
+            <wp14:sizeRelV relativeFrom="margin">
+              <wp14:pctHeight>0</wp14:pctHeight>
+            </wp14:sizeRelV>
+          </wp:anchor>
+        </w:drawing>
+      </w:r>
+      <w:r>
+        <w:drawing>
+          <wp:anchor distT="0" distB="0" distL="114300" distR="114300" simplePos="0" relativeHeight="251658239" behindDoc="0" locked="0" layoutInCell="1" allowOverlap="1" wp14:anchorId="29075018" wp14:editId="19BDED16">
+            <wp:simplePos x="0" y="0"/>
+            <wp:positionH relativeFrom="margin">
+              <wp:posOffset>-338123</wp:posOffset>
+            </wp:positionH>
+            <wp:positionV relativeFrom="paragraph">
+              <wp:posOffset>2091244</wp:posOffset>
+            </wp:positionV>
+            <wp:extent cx="1648324" cy="871017"/>
+            <wp:effectExtent l="0" t="0" r="0" b="5715"/>
+            <wp:wrapNone/>
+            <wp:docPr id="1170402205" name="Picture 1"/>
+            <wp:cNvGraphicFramePr>
+              <a:graphicFrameLocks xmlns:a="http://schemas.openxmlformats.org/drawingml/2006/main" noChangeAspect="1"/>
+            </wp:cNvGraphicFramePr>
+            <a:graphic xmlns:a="http://schemas.openxmlformats.org/drawingml/2006/main">
+              <a:graphicData uri="http://schemas.openxmlformats.org/drawingml/2006/picture">
+                <pic:pic xmlns:pic="http://schemas.openxmlformats.org/drawingml/2006/picture">
+                  <pic:nvPicPr>
+                    <pic:cNvPr id="1170402205" name=""/>
+                    <pic:cNvPicPr/>
+                  </pic:nvPicPr>
+                  <pic:blipFill>
+                    <a:blip r:embed="rId48"/>
+                    <a:stretch>
+                      <a:fillRect/>
+                    </a:stretch>
+                  </pic:blipFill>
+                  <pic:spPr>
+                    <a:xfrm>
+                      <a:off x="0" y="0"/>
+                      <a:ext cx="1648324" cy="871017"/>
+                    </a:xfrm>
+                    <a:prstGeom prst="rect">
+                      <a:avLst/>
+                    </a:prstGeom>
+                  </pic:spPr>
+                </pic:pic>
+              </a:graphicData>
+            </a:graphic>
+            <wp14:sizeRelH relativeFrom="margin">
+              <wp14:pctWidth>0</wp14:pctWidth>
+            </wp14:sizeRelH>
+            <wp14:sizeRelV relativeFrom="margin">
+              <wp14:pctHeight>0</wp14:pctHeight>
+            </wp14:sizeRelV>
+          </wp:anchor>
+        </w:drawing>
+      </w:r>
+      <w:r>
+        <w:drawing>
+          <wp:anchor distT="0" distB="0" distL="114300" distR="114300" simplePos="0" relativeHeight="251671552" behindDoc="0" locked="0" layoutInCell="1" allowOverlap="1" wp14:anchorId="029E989B" wp14:editId="32914DA1">
+            <wp:simplePos x="0" y="0"/>
+            <wp:positionH relativeFrom="margin">
+              <wp:posOffset>5437073</wp:posOffset>
+            </wp:positionH>
+            <wp:positionV relativeFrom="paragraph">
+              <wp:posOffset>-249217</wp:posOffset>
+            </wp:positionV>
+            <wp:extent cx="1238765" cy="1361872"/>
+            <wp:effectExtent l="0" t="0" r="0" b="0"/>
+            <wp:wrapNone/>
+            <wp:docPr id="1357732871" name="Picture 1"/>
+            <wp:cNvGraphicFramePr>
+              <a:graphicFrameLocks xmlns:a="http://schemas.openxmlformats.org/drawingml/2006/main" noChangeAspect="1"/>
+            </wp:cNvGraphicFramePr>
+            <a:graphic xmlns:a="http://schemas.openxmlformats.org/drawingml/2006/main">
+              <a:graphicData uri="http://schemas.openxmlformats.org/drawingml/2006/picture">
+                <pic:pic xmlns:pic="http://schemas.openxmlformats.org/drawingml/2006/picture">
+                  <pic:nvPicPr>
+                    <pic:cNvPr id="1357732871" name=""/>
+                    <pic:cNvPicPr/>
+                  </pic:nvPicPr>
+                  <pic:blipFill>
+                    <a:blip r:embed="rId49"/>
+                    <a:stretch>
+                      <a:fillRect/>
+                    </a:stretch>
+                  </pic:blipFill>
+                  <pic:spPr>
+                    <a:xfrm>
+                      <a:off x="0" y="0"/>
+                      <a:ext cx="1238765" cy="1361872"/>
+                    </a:xfrm>
+                    <a:prstGeom prst="rect">
+                      <a:avLst/>
+                    </a:prstGeom>
+                  </pic:spPr>
+                </pic:pic>
+              </a:graphicData>
+            </a:graphic>
+            <wp14:sizeRelH relativeFrom="margin">
+              <wp14:pctWidth>0</wp14:pctWidth>
+            </wp14:sizeRelH>
+            <wp14:sizeRelV relativeFrom="margin">
+              <wp14:pctHeight>0</wp14:pctHeight>
+            </wp14:sizeRelV>
+          </wp:anchor>
+        </w:drawing>
+      </w:r>
+      <w:r>
+        <w:drawing>
+          <wp:anchor distT="0" distB="0" distL="114300" distR="114300" simplePos="0" relativeHeight="251669504" behindDoc="0" locked="0" layoutInCell="1" allowOverlap="1" wp14:anchorId="25B36D1F" wp14:editId="5417DB2C">
+            <wp:simplePos x="0" y="0"/>
+            <wp:positionH relativeFrom="margin">
+              <wp:posOffset>5008447</wp:posOffset>
+            </wp:positionH>
+            <wp:positionV relativeFrom="paragraph">
+              <wp:posOffset>-337915</wp:posOffset>
+            </wp:positionV>
+            <wp:extent cx="1059873" cy="148527"/>
+            <wp:effectExtent l="0" t="0" r="0" b="4445"/>
+            <wp:wrapNone/>
+            <wp:docPr id="1401034076" name="Picture 1"/>
+            <wp:cNvGraphicFramePr>
+              <a:graphicFrameLocks xmlns:a="http://schemas.openxmlformats.org/drawingml/2006/main" noChangeAspect="1"/>
+            </wp:cNvGraphicFramePr>
+            <a:graphic xmlns:a="http://schemas.openxmlformats.org/drawingml/2006/main">
+              <a:graphicData uri="http://schemas.openxmlformats.org/drawingml/2006/picture">
+                <pic:pic xmlns:pic="http://schemas.openxmlformats.org/drawingml/2006/picture">
+                  <pic:nvPicPr>
+                    <pic:cNvPr id="1401034076" name=""/>
+                    <pic:cNvPicPr/>
+                  </pic:nvPicPr>
+                  <pic:blipFill>
+                    <a:blip r:embed="rId50"/>
+                    <a:stretch>
+                      <a:fillRect/>
+                    </a:stretch>
+                  </pic:blipFill>
+                  <pic:spPr>
+                    <a:xfrm>
+                      <a:off x="0" y="0"/>
+                      <a:ext cx="1059873" cy="148527"/>
+                    </a:xfrm>
+                    <a:prstGeom prst="rect">
+                      <a:avLst/>
+                    </a:prstGeom>
+                  </pic:spPr>
+                </pic:pic>
+              </a:graphicData>
+            </a:graphic>
+            <wp14:sizeRelH relativeFrom="margin">
+              <wp14:pctWidth>0</wp14:pctWidth>
+            </wp14:sizeRelH>
+            <wp14:sizeRelV relativeFrom="margin">
+              <wp14:pctHeight>0</wp14:pctHeight>
+            </wp14:sizeRelV>
+          </wp:anchor>
+        </w:drawing>
+      </w:r>
+      <w:r>
+        <w:drawing>
+          <wp:anchor distT="0" distB="0" distL="114300" distR="114300" simplePos="0" relativeHeight="251675648" behindDoc="0" locked="0" layoutInCell="1" allowOverlap="1" wp14:anchorId="76E53BCE" wp14:editId="3ECA0FDA">
+            <wp:simplePos x="0" y="0"/>
+            <wp:positionH relativeFrom="column">
+              <wp:posOffset>3617392</wp:posOffset>
+            </wp:positionH>
+            <wp:positionV relativeFrom="paragraph">
+              <wp:posOffset>-294532</wp:posOffset>
+            </wp:positionV>
+            <wp:extent cx="1536970" cy="756815"/>
+            <wp:effectExtent l="0" t="0" r="6350" b="5715"/>
+            <wp:wrapNone/>
+            <wp:docPr id="626700921" name="Picture 1"/>
+            <wp:cNvGraphicFramePr>
+              <a:graphicFrameLocks xmlns:a="http://schemas.openxmlformats.org/drawingml/2006/main" noChangeAspect="1"/>
+            </wp:cNvGraphicFramePr>
+            <a:graphic xmlns:a="http://schemas.openxmlformats.org/drawingml/2006/main">
+              <a:graphicData uri="http://schemas.openxmlformats.org/drawingml/2006/picture">
+                <pic:pic xmlns:pic="http://schemas.openxmlformats.org/drawingml/2006/picture">
+                  <pic:nvPicPr>
+                    <pic:cNvPr id="626700921" name=""/>
+                    <pic:cNvPicPr/>
+                  </pic:nvPicPr>
+                  <pic:blipFill>
+                    <a:blip r:embed="rId51"/>
+                    <a:stretch>
+                      <a:fillRect/>
+                    </a:stretch>
+                  </pic:blipFill>
+                  <pic:spPr>
+                    <a:xfrm>
+                      <a:off x="0" y="0"/>
+                      <a:ext cx="1536970" cy="756815"/>
+                    </a:xfrm>
+                    <a:prstGeom prst="rect">
+                      <a:avLst/>
+                    </a:prstGeom>
+                  </pic:spPr>
+                </pic:pic>
+              </a:graphicData>
+            </a:graphic>
+            <wp14:sizeRelH relativeFrom="margin">
+              <wp14:pctWidth>0</wp14:pctWidth>
+            </wp14:sizeRelH>
+            <wp14:sizeRelV relativeFrom="margin">
+              <wp14:pctHeight>0</wp14:pctHeight>
+            </wp14:sizeRelV>
+          </wp:anchor>
+        </w:drawing>
+      </w:r>
+      <w:r>
+        <w:drawing>
+          <wp:anchor distT="0" distB="0" distL="114300" distR="114300" simplePos="0" relativeHeight="251676672" behindDoc="0" locked="0" layoutInCell="1" allowOverlap="1" wp14:anchorId="0CCB5DBB" wp14:editId="709DF656">
+            <wp:simplePos x="0" y="0"/>
+            <wp:positionH relativeFrom="column">
+              <wp:posOffset>2445493</wp:posOffset>
+            </wp:positionH>
+            <wp:positionV relativeFrom="paragraph">
+              <wp:posOffset>-165181</wp:posOffset>
+            </wp:positionV>
+            <wp:extent cx="1217729" cy="350871"/>
+            <wp:effectExtent l="0" t="0" r="1905" b="0"/>
+            <wp:wrapNone/>
+            <wp:docPr id="54017637" name="Picture 1"/>
+            <wp:cNvGraphicFramePr>
+              <a:graphicFrameLocks xmlns:a="http://schemas.openxmlformats.org/drawingml/2006/main" noChangeAspect="1"/>
+            </wp:cNvGraphicFramePr>
+            <a:graphic xmlns:a="http://schemas.openxmlformats.org/drawingml/2006/main">
+              <a:graphicData uri="http://schemas.openxmlformats.org/drawingml/2006/picture">
+                <pic:pic xmlns:pic="http://schemas.openxmlformats.org/drawingml/2006/picture">
+                  <pic:nvPicPr>
+                    <pic:cNvPr id="54017637" name=""/>
+                    <pic:cNvPicPr/>
+                  </pic:nvPicPr>
+                  <pic:blipFill>
+                    <a:blip r:embed="rId52"/>
+                    <a:stretch>
+                      <a:fillRect/>
+                    </a:stretch>
+                  </pic:blipFill>
+                  <pic:spPr>
+                    <a:xfrm>
+                      <a:off x="0" y="0"/>
+                      <a:ext cx="1217729" cy="350871"/>
+                    </a:xfrm>
+                    <a:prstGeom prst="rect">
+                      <a:avLst/>
+                    </a:prstGeom>
+                  </pic:spPr>
+                </pic:pic>
+              </a:graphicData>
+            </a:graphic>
+            <wp14:sizeRelH relativeFrom="margin">
+              <wp14:pctWidth>0</wp14:pctWidth>
+            </wp14:sizeRelH>
+            <wp14:sizeRelV relativeFrom="margin">
+              <wp14:pctHeight>0</wp14:pctHeight>
+            </wp14:sizeRelV>
+          </wp:anchor>
+        </w:drawing>
+      </w:r>
+      <w:r>
+        <w:drawing>
+          <wp:anchor distT="0" distB="0" distL="114300" distR="114300" simplePos="0" relativeHeight="251673600" behindDoc="0" locked="0" layoutInCell="1" allowOverlap="1" wp14:anchorId="695696F0" wp14:editId="2F5D8B9D">
+            <wp:simplePos x="0" y="0"/>
+            <wp:positionH relativeFrom="margin">
+              <wp:posOffset>-369651</wp:posOffset>
+            </wp:positionH>
+            <wp:positionV relativeFrom="paragraph">
+              <wp:posOffset>223736</wp:posOffset>
+            </wp:positionV>
+            <wp:extent cx="2071991" cy="1844325"/>
+            <wp:effectExtent l="0" t="0" r="5080" b="3810"/>
+            <wp:wrapNone/>
+            <wp:docPr id="429070765" name="Picture 1"/>
+            <wp:cNvGraphicFramePr>
+              <a:graphicFrameLocks xmlns:a="http://schemas.openxmlformats.org/drawingml/2006/main" noChangeAspect="1"/>
+            </wp:cNvGraphicFramePr>
+            <a:graphic xmlns:a="http://schemas.openxmlformats.org/drawingml/2006/main">
+              <a:graphicData uri="http://schemas.openxmlformats.org/drawingml/2006/picture">
+                <pic:pic xmlns:pic="http://schemas.openxmlformats.org/drawingml/2006/picture">
+                  <pic:nvPicPr>
+                    <pic:cNvPr id="429070765" name=""/>
+                    <pic:cNvPicPr/>
+                  </pic:nvPicPr>
+                  <pic:blipFill>
+                    <a:blip r:embed="rId53"/>
+                    <a:stretch>
+                      <a:fillRect/>
+                    </a:stretch>
+                  </pic:blipFill>
+                  <pic:spPr>
+                    <a:xfrm>
+                      <a:off x="0" y="0"/>
+                      <a:ext cx="2071991" cy="1844325"/>
+                    </a:xfrm>
+                    <a:prstGeom prst="rect">
+                      <a:avLst/>
+                    </a:prstGeom>
+                  </pic:spPr>
+                </pic:pic>
+              </a:graphicData>
+            </a:graphic>
+            <wp14:sizeRelH relativeFrom="margin">
+              <wp14:pctWidth>0</wp14:pctWidth>
+            </wp14:sizeRelH>
+            <wp14:sizeRelV relativeFrom="margin">
+              <wp14:pctHeight>0</wp14:pctHeight>
+            </wp14:sizeRelV>
+          </wp:anchor>
+        </w:drawing>
+      </w:r>
+      <w:r>
+        <w:drawing>
+          <wp:anchor distT="0" distB="0" distL="114300" distR="114300" simplePos="0" relativeHeight="251661312" behindDoc="0" locked="0" layoutInCell="1" allowOverlap="1" wp14:anchorId="45FBF91F" wp14:editId="2B92B967">
+            <wp:simplePos x="0" y="0"/>
+            <wp:positionH relativeFrom="column">
+              <wp:posOffset>1624438</wp:posOffset>
+            </wp:positionH>
+            <wp:positionV relativeFrom="paragraph">
+              <wp:posOffset>-273469</wp:posOffset>
+            </wp:positionV>
+            <wp:extent cx="1808399" cy="211371"/>
+            <wp:effectExtent l="0" t="0" r="1905" b="0"/>
+            <wp:wrapNone/>
+            <wp:docPr id="1345319980" name="Picture 1"/>
+            <wp:cNvGraphicFramePr>
+              <a:graphicFrameLocks xmlns:a="http://schemas.openxmlformats.org/drawingml/2006/main" noChangeAspect="1"/>
+            </wp:cNvGraphicFramePr>
+            <a:graphic xmlns:a="http://schemas.openxmlformats.org/drawingml/2006/main">
+              <a:graphicData uri="http://schemas.openxmlformats.org/drawingml/2006/picture">
+                <pic:pic xmlns:pic="http://schemas.openxmlformats.org/drawingml/2006/picture">
+                  <pic:nvPicPr>
+                    <pic:cNvPr id="1345319980" name=""/>
+                    <pic:cNvPicPr/>
+                  </pic:nvPicPr>
+                  <pic:blipFill>
+                    <a:blip r:embed="rId54"/>
+                    <a:stretch>
+                      <a:fillRect/>
+                    </a:stretch>
+                  </pic:blipFill>
+                  <pic:spPr>
+                    <a:xfrm>
+                      <a:off x="0" y="0"/>
+                      <a:ext cx="1808399" cy="211371"/>
+                    </a:xfrm>
+                    <a:prstGeom prst="rect">
+                      <a:avLst/>
+                    </a:prstGeom>
+                  </pic:spPr>
+                </pic:pic>
+              </a:graphicData>
+            </a:graphic>
+            <wp14:sizeRelH relativeFrom="margin">
+              <wp14:pctWidth>0</wp14:pctWidth>
+            </wp14:sizeRelH>
+            <wp14:sizeRelV relativeFrom="margin">
+              <wp14:pctHeight>0</wp14:pctHeight>
+            </wp14:sizeRelV>
+          </wp:anchor>
+        </w:drawing>
+      </w:r>
+    </w:p>
     <w:sectPr>
       <w:pgSz w:w="12240" w:h="15840"/>
       <w:pgMar w:top="720" w:right="720" w:bottom="720" w:left="720" w:header="720" w:footer="720" w:gutter="0"/>

</xml_diff>